<commit_message>
Updated CampusBot report with project links
</commit_message>
<xml_diff>
--- a/01-CampusBot-Chatbot/CampusBot.docx
+++ b/01-CampusBot-Chatbot/CampusBot.docx
@@ -17,7 +17,6 @@
           <w14:ligatures w14:val="none"/>
         </w:rPr>
       </w:pPr>
-      <w:proofErr w:type="spellStart"/>
       <w:r>
         <w:rPr>
           <w:rFonts w:ascii="Times New Roman" w:eastAsia="Times New Roman" w:hAnsi="Times New Roman" w:cs="Times New Roman"/>
@@ -29,10 +28,467 @@
           <w:lang w:eastAsia="en-IN"/>
           <w14:ligatures w14:val="none"/>
         </w:rPr>
-        <w:t>CampusBot</w:t>
-      </w:r>
-      <w:proofErr w:type="spellEnd"/>
-      <w:r>
+        <w:t>CampusBot – AI Campus Assistant Chatbot</w:t>
+      </w:r>
+    </w:p>
+    <w:p>
+      <w:pPr>
+        <w:spacing w:before="100" w:beforeAutospacing="1" w:after="100" w:afterAutospacing="1" w:line="240" w:lineRule="auto"/>
+        <w:outlineLvl w:val="1"/>
+        <w:rPr>
+          <w:rFonts w:ascii="Times New Roman" w:eastAsia="Times New Roman" w:hAnsi="Times New Roman" w:cs="Times New Roman"/>
+          <w:b/>
+          <w:bCs/>
+          <w:kern w:val="0"/>
+          <w:sz w:val="36"/>
+          <w:szCs w:val="36"/>
+          <w:lang w:eastAsia="en-IN"/>
+          <w14:ligatures w14:val="none"/>
+        </w:rPr>
+      </w:pPr>
+      <w:r>
+        <w:rPr>
+          <w:rFonts w:ascii="Times New Roman" w:eastAsia="Times New Roman" w:hAnsi="Times New Roman" w:cs="Times New Roman"/>
+          <w:b/>
+          <w:bCs/>
+          <w:kern w:val="0"/>
+          <w:sz w:val="36"/>
+          <w:szCs w:val="36"/>
+          <w:lang w:eastAsia="en-IN"/>
+          <w14:ligatures w14:val="none"/>
+        </w:rPr>
+        <w:t>1. Project Title</w:t>
+      </w:r>
+    </w:p>
+    <w:p>
+      <w:pPr>
+        <w:spacing w:before="100" w:beforeAutospacing="1" w:after="100" w:afterAutospacing="1" w:line="240" w:lineRule="auto"/>
+        <w:rPr>
+          <w:rFonts w:ascii="Times New Roman" w:eastAsia="Times New Roman" w:hAnsi="Times New Roman" w:cs="Times New Roman"/>
+          <w:kern w:val="0"/>
+          <w:lang w:eastAsia="en-IN"/>
+          <w14:ligatures w14:val="none"/>
+        </w:rPr>
+      </w:pPr>
+      <w:r>
+        <w:rPr>
+          <w:rFonts w:ascii="Times New Roman" w:eastAsia="Times New Roman" w:hAnsi="Times New Roman" w:cs="Times New Roman"/>
+          <w:b/>
+          <w:bCs/>
+          <w:kern w:val="0"/>
+          <w:lang w:eastAsia="en-IN"/>
+          <w14:ligatures w14:val="none"/>
+        </w:rPr>
+        <w:t>CampusBot – AI Powered Campus Assistant Chatbot</w:t>
+      </w:r>
+    </w:p>
+    <w:p>
+      <w:pPr>
+        <w:spacing w:after="0" w:line="240" w:lineRule="auto"/>
+        <w:rPr>
+          <w:rFonts w:ascii="Times New Roman" w:eastAsia="Times New Roman" w:hAnsi="Times New Roman" w:cs="Times New Roman"/>
+          <w:kern w:val="0"/>
+          <w:lang w:eastAsia="en-IN"/>
+          <w14:ligatures w14:val="none"/>
+        </w:rPr>
+      </w:pPr>
+      <w:r>
+        <w:rPr>
+          <w:rFonts w:ascii="Times New Roman" w:eastAsia="Times New Roman" w:hAnsi="Times New Roman" w:cs="Times New Roman"/>
+          <w:kern w:val="0"/>
+          <w:lang w:eastAsia="en-IN"/>
+          <w14:ligatures w14:val="none"/>
+        </w:rPr>
+        <w:pict w14:anchorId="5E1BB888">
+          <v:rect id="_x0000_i1025" style="width:0;height:1.5pt" o:hralign="center" o:hrstd="t" o:hr="t" fillcolor="#a0a0a0" stroked="f"/>
+        </w:pict>
+      </w:r>
+    </w:p>
+    <w:p>
+      <w:pPr>
+        <w:spacing w:before="100" w:beforeAutospacing="1" w:after="100" w:afterAutospacing="1" w:line="240" w:lineRule="auto"/>
+        <w:outlineLvl w:val="1"/>
+        <w:rPr>
+          <w:rFonts w:ascii="Times New Roman" w:eastAsia="Times New Roman" w:hAnsi="Times New Roman" w:cs="Times New Roman"/>
+          <w:b/>
+          <w:bCs/>
+          <w:kern w:val="0"/>
+          <w:sz w:val="36"/>
+          <w:szCs w:val="36"/>
+          <w:lang w:eastAsia="en-IN"/>
+          <w14:ligatures w14:val="none"/>
+        </w:rPr>
+      </w:pPr>
+      <w:r>
+        <w:rPr>
+          <w:rFonts w:ascii="Times New Roman" w:eastAsia="Times New Roman" w:hAnsi="Times New Roman" w:cs="Times New Roman"/>
+          <w:b/>
+          <w:bCs/>
+          <w:kern w:val="0"/>
+          <w:sz w:val="36"/>
+          <w:szCs w:val="36"/>
+          <w:lang w:eastAsia="en-IN"/>
+          <w14:ligatures w14:val="none"/>
+        </w:rPr>
+        <w:t>2. Project Objective &amp; Description</w:t>
+      </w:r>
+    </w:p>
+    <w:p>
+      <w:pPr>
+        <w:spacing w:before="100" w:beforeAutospacing="1" w:after="100" w:afterAutospacing="1" w:line="240" w:lineRule="auto"/>
+        <w:outlineLvl w:val="2"/>
+        <w:rPr>
+          <w:rFonts w:ascii="Times New Roman" w:eastAsia="Times New Roman" w:hAnsi="Times New Roman" w:cs="Times New Roman"/>
+          <w:b/>
+          <w:bCs/>
+          <w:kern w:val="0"/>
+          <w:sz w:val="27"/>
+          <w:szCs w:val="27"/>
+          <w:lang w:eastAsia="en-IN"/>
+          <w14:ligatures w14:val="none"/>
+        </w:rPr>
+      </w:pPr>
+      <w:r>
+        <w:rPr>
+          <w:rFonts w:ascii="Times New Roman" w:eastAsia="Times New Roman" w:hAnsi="Times New Roman" w:cs="Times New Roman"/>
+          <w:b/>
+          <w:bCs/>
+          <w:kern w:val="0"/>
+          <w:sz w:val="27"/>
+          <w:szCs w:val="27"/>
+          <w:lang w:eastAsia="en-IN"/>
+          <w14:ligatures w14:val="none"/>
+        </w:rPr>
+        <w:t>Objective:</w:t>
+      </w:r>
+    </w:p>
+    <w:p>
+      <w:pPr>
+        <w:spacing w:before="100" w:beforeAutospacing="1" w:after="100" w:afterAutospacing="1" w:line="240" w:lineRule="auto"/>
+        <w:rPr>
+          <w:rFonts w:ascii="Times New Roman" w:eastAsia="Times New Roman" w:hAnsi="Times New Roman" w:cs="Times New Roman"/>
+          <w:kern w:val="0"/>
+          <w:lang w:eastAsia="en-IN"/>
+          <w14:ligatures w14:val="none"/>
+        </w:rPr>
+      </w:pPr>
+      <w:r>
+        <w:rPr>
+          <w:rFonts w:ascii="Times New Roman" w:eastAsia="Times New Roman" w:hAnsi="Times New Roman" w:cs="Times New Roman"/>
+          <w:kern w:val="0"/>
+          <w:lang w:eastAsia="en-IN"/>
+          <w14:ligatures w14:val="none"/>
+        </w:rPr>
+        <w:t>The objective of CampusBot is to develop an interactive chatbot that helps students, faculty, and visitors get quick answers related to campus services.</w:t>
+      </w:r>
+    </w:p>
+    <w:p>
+      <w:pPr>
+        <w:spacing w:before="100" w:beforeAutospacing="1" w:after="100" w:afterAutospacing="1" w:line="240" w:lineRule="auto"/>
+        <w:rPr>
+          <w:rFonts w:ascii="Times New Roman" w:eastAsia="Times New Roman" w:hAnsi="Times New Roman" w:cs="Times New Roman"/>
+          <w:kern w:val="0"/>
+          <w:lang w:eastAsia="en-IN"/>
+          <w14:ligatures w14:val="none"/>
+        </w:rPr>
+      </w:pPr>
+      <w:r>
+        <w:rPr>
+          <w:rFonts w:ascii="Times New Roman" w:eastAsia="Times New Roman" w:hAnsi="Times New Roman" w:cs="Times New Roman"/>
+          <w:kern w:val="0"/>
+          <w:lang w:eastAsia="en-IN"/>
+          <w14:ligatures w14:val="none"/>
+        </w:rPr>
+        <w:t>The chatbot reduces the need for manually searching information by providing instant automated responses.</w:t>
+      </w:r>
+    </w:p>
+    <w:p>
+      <w:pPr>
+        <w:spacing w:before="100" w:beforeAutospacing="1" w:after="100" w:afterAutospacing="1" w:line="240" w:lineRule="auto"/>
+        <w:outlineLvl w:val="2"/>
+        <w:rPr>
+          <w:rFonts w:ascii="Times New Roman" w:eastAsia="Times New Roman" w:hAnsi="Times New Roman" w:cs="Times New Roman"/>
+          <w:b/>
+          <w:bCs/>
+          <w:kern w:val="0"/>
+          <w:sz w:val="27"/>
+          <w:szCs w:val="27"/>
+          <w:lang w:eastAsia="en-IN"/>
+          <w14:ligatures w14:val="none"/>
+        </w:rPr>
+      </w:pPr>
+      <w:r>
+        <w:rPr>
+          <w:rFonts w:ascii="Times New Roman" w:eastAsia="Times New Roman" w:hAnsi="Times New Roman" w:cs="Times New Roman"/>
+          <w:b/>
+          <w:bCs/>
+          <w:kern w:val="0"/>
+          <w:sz w:val="27"/>
+          <w:szCs w:val="27"/>
+          <w:lang w:eastAsia="en-IN"/>
+          <w14:ligatures w14:val="none"/>
+        </w:rPr>
+        <w:t>Description:</w:t>
+      </w:r>
+    </w:p>
+    <w:p>
+      <w:pPr>
+        <w:spacing w:before="100" w:beforeAutospacing="1" w:after="100" w:afterAutospacing="1" w:line="240" w:lineRule="auto"/>
+        <w:rPr>
+          <w:rFonts w:ascii="Times New Roman" w:eastAsia="Times New Roman" w:hAnsi="Times New Roman" w:cs="Times New Roman"/>
+          <w:kern w:val="0"/>
+          <w:lang w:eastAsia="en-IN"/>
+          <w14:ligatures w14:val="none"/>
+        </w:rPr>
+      </w:pPr>
+      <w:r>
+        <w:rPr>
+          <w:rFonts w:ascii="Times New Roman" w:eastAsia="Times New Roman" w:hAnsi="Times New Roman" w:cs="Times New Roman"/>
+          <w:kern w:val="0"/>
+          <w:lang w:eastAsia="en-IN"/>
+          <w14:ligatures w14:val="none"/>
+        </w:rPr>
+        <w:t>CampusBot is a university assistant chatbot designed to answer common student queries. It provides information about:</w:t>
+      </w:r>
+    </w:p>
+    <w:p>
+      <w:pPr>
+        <w:numPr>
+          <w:ilvl w:val="0"/>
+          <w:numId w:val="1"/>
+        </w:numPr>
+        <w:spacing w:before="100" w:beforeAutospacing="1" w:after="100" w:afterAutospacing="1" w:line="240" w:lineRule="auto"/>
+        <w:rPr>
+          <w:rFonts w:ascii="Times New Roman" w:eastAsia="Times New Roman" w:hAnsi="Times New Roman" w:cs="Times New Roman"/>
+          <w:kern w:val="0"/>
+          <w:lang w:eastAsia="en-IN"/>
+          <w14:ligatures w14:val="none"/>
+        </w:rPr>
+      </w:pPr>
+      <w:r>
+        <w:rPr>
+          <w:rFonts w:ascii="Times New Roman" w:eastAsia="Times New Roman" w:hAnsi="Times New Roman" w:cs="Times New Roman"/>
+          <w:kern w:val="0"/>
+          <w:lang w:eastAsia="en-IN"/>
+          <w14:ligatures w14:val="none"/>
+        </w:rPr>
+        <w:t>Admissions</w:t>
+      </w:r>
+    </w:p>
+    <w:p>
+      <w:pPr>
+        <w:numPr>
+          <w:ilvl w:val="0"/>
+          <w:numId w:val="1"/>
+        </w:numPr>
+        <w:spacing w:before="100" w:beforeAutospacing="1" w:after="100" w:afterAutospacing="1" w:line="240" w:lineRule="auto"/>
+        <w:rPr>
+          <w:rFonts w:ascii="Times New Roman" w:eastAsia="Times New Roman" w:hAnsi="Times New Roman" w:cs="Times New Roman"/>
+          <w:kern w:val="0"/>
+          <w:lang w:eastAsia="en-IN"/>
+          <w14:ligatures w14:val="none"/>
+        </w:rPr>
+      </w:pPr>
+      <w:r>
+        <w:rPr>
+          <w:rFonts w:ascii="Times New Roman" w:eastAsia="Times New Roman" w:hAnsi="Times New Roman" w:cs="Times New Roman"/>
+          <w:kern w:val="0"/>
+          <w:lang w:eastAsia="en-IN"/>
+          <w14:ligatures w14:val="none"/>
+        </w:rPr>
+        <w:t>Library facilities</w:t>
+      </w:r>
+    </w:p>
+    <w:p>
+      <w:pPr>
+        <w:numPr>
+          <w:ilvl w:val="0"/>
+          <w:numId w:val="1"/>
+        </w:numPr>
+        <w:spacing w:before="100" w:beforeAutospacing="1" w:after="100" w:afterAutospacing="1" w:line="240" w:lineRule="auto"/>
+        <w:rPr>
+          <w:rFonts w:ascii="Times New Roman" w:eastAsia="Times New Roman" w:hAnsi="Times New Roman" w:cs="Times New Roman"/>
+          <w:kern w:val="0"/>
+          <w:lang w:eastAsia="en-IN"/>
+          <w14:ligatures w14:val="none"/>
+        </w:rPr>
+      </w:pPr>
+      <w:r>
+        <w:rPr>
+          <w:rFonts w:ascii="Times New Roman" w:eastAsia="Times New Roman" w:hAnsi="Times New Roman" w:cs="Times New Roman"/>
+          <w:kern w:val="0"/>
+          <w:lang w:eastAsia="en-IN"/>
+          <w14:ligatures w14:val="none"/>
+        </w:rPr>
+        <w:t>Fee structure</w:t>
+      </w:r>
+    </w:p>
+    <w:p>
+      <w:pPr>
+        <w:numPr>
+          <w:ilvl w:val="0"/>
+          <w:numId w:val="1"/>
+        </w:numPr>
+        <w:spacing w:before="100" w:beforeAutospacing="1" w:after="100" w:afterAutospacing="1" w:line="240" w:lineRule="auto"/>
+        <w:rPr>
+          <w:rFonts w:ascii="Times New Roman" w:eastAsia="Times New Roman" w:hAnsi="Times New Roman" w:cs="Times New Roman"/>
+          <w:kern w:val="0"/>
+          <w:lang w:eastAsia="en-IN"/>
+          <w14:ligatures w14:val="none"/>
+        </w:rPr>
+      </w:pPr>
+      <w:r>
+        <w:rPr>
+          <w:rFonts w:ascii="Times New Roman" w:eastAsia="Times New Roman" w:hAnsi="Times New Roman" w:cs="Times New Roman"/>
+          <w:kern w:val="0"/>
+          <w:lang w:eastAsia="en-IN"/>
+          <w14:ligatures w14:val="none"/>
+        </w:rPr>
+        <w:t>Examination schedules</w:t>
+      </w:r>
+    </w:p>
+    <w:p>
+      <w:pPr>
+        <w:numPr>
+          <w:ilvl w:val="0"/>
+          <w:numId w:val="1"/>
+        </w:numPr>
+        <w:spacing w:before="100" w:beforeAutospacing="1" w:after="100" w:afterAutospacing="1" w:line="240" w:lineRule="auto"/>
+        <w:rPr>
+          <w:rFonts w:ascii="Times New Roman" w:eastAsia="Times New Roman" w:hAnsi="Times New Roman" w:cs="Times New Roman"/>
+          <w:kern w:val="0"/>
+          <w:lang w:eastAsia="en-IN"/>
+          <w14:ligatures w14:val="none"/>
+        </w:rPr>
+      </w:pPr>
+      <w:r>
+        <w:rPr>
+          <w:rFonts w:ascii="Times New Roman" w:eastAsia="Times New Roman" w:hAnsi="Times New Roman" w:cs="Times New Roman"/>
+          <w:kern w:val="0"/>
+          <w:lang w:eastAsia="en-IN"/>
+          <w14:ligatures w14:val="none"/>
+        </w:rPr>
+        <w:t>Hostel accommodation</w:t>
+      </w:r>
+    </w:p>
+    <w:p>
+      <w:pPr>
+        <w:numPr>
+          <w:ilvl w:val="0"/>
+          <w:numId w:val="1"/>
+        </w:numPr>
+        <w:spacing w:before="100" w:beforeAutospacing="1" w:after="100" w:afterAutospacing="1" w:line="240" w:lineRule="auto"/>
+        <w:rPr>
+          <w:rFonts w:ascii="Times New Roman" w:eastAsia="Times New Roman" w:hAnsi="Times New Roman" w:cs="Times New Roman"/>
+          <w:kern w:val="0"/>
+          <w:lang w:eastAsia="en-IN"/>
+          <w14:ligatures w14:val="none"/>
+        </w:rPr>
+      </w:pPr>
+      <w:r>
+        <w:rPr>
+          <w:rFonts w:ascii="Times New Roman" w:eastAsia="Times New Roman" w:hAnsi="Times New Roman" w:cs="Times New Roman"/>
+          <w:kern w:val="0"/>
+          <w:lang w:eastAsia="en-IN"/>
+          <w14:ligatures w14:val="none"/>
+        </w:rPr>
+        <w:t>Placement information</w:t>
+      </w:r>
+    </w:p>
+    <w:p>
+      <w:pPr>
+        <w:numPr>
+          <w:ilvl w:val="0"/>
+          <w:numId w:val="1"/>
+        </w:numPr>
+        <w:spacing w:before="100" w:beforeAutospacing="1" w:after="100" w:afterAutospacing="1" w:line="240" w:lineRule="auto"/>
+        <w:rPr>
+          <w:rFonts w:ascii="Times New Roman" w:eastAsia="Times New Roman" w:hAnsi="Times New Roman" w:cs="Times New Roman"/>
+          <w:kern w:val="0"/>
+          <w:lang w:eastAsia="en-IN"/>
+          <w14:ligatures w14:val="none"/>
+        </w:rPr>
+      </w:pPr>
+      <w:r>
+        <w:rPr>
+          <w:rFonts w:ascii="Times New Roman" w:eastAsia="Times New Roman" w:hAnsi="Times New Roman" w:cs="Times New Roman"/>
+          <w:kern w:val="0"/>
+          <w:lang w:eastAsia="en-IN"/>
+          <w14:ligatures w14:val="none"/>
+        </w:rPr>
+        <w:t>Campus events</w:t>
+      </w:r>
+    </w:p>
+    <w:p>
+      <w:pPr>
+        <w:numPr>
+          <w:ilvl w:val="0"/>
+          <w:numId w:val="1"/>
+        </w:numPr>
+        <w:spacing w:before="100" w:beforeAutospacing="1" w:after="100" w:afterAutospacing="1" w:line="240" w:lineRule="auto"/>
+        <w:rPr>
+          <w:rFonts w:ascii="Times New Roman" w:eastAsia="Times New Roman" w:hAnsi="Times New Roman" w:cs="Times New Roman"/>
+          <w:kern w:val="0"/>
+          <w:lang w:eastAsia="en-IN"/>
+          <w14:ligatures w14:val="none"/>
+        </w:rPr>
+      </w:pPr>
+      <w:r>
+        <w:rPr>
+          <w:rFonts w:ascii="Times New Roman" w:eastAsia="Times New Roman" w:hAnsi="Times New Roman" w:cs="Times New Roman"/>
+          <w:kern w:val="0"/>
+          <w:lang w:eastAsia="en-IN"/>
+          <w14:ligatures w14:val="none"/>
+        </w:rPr>
+        <w:t>Contact details</w:t>
+      </w:r>
+    </w:p>
+    <w:p>
+      <w:pPr>
+        <w:spacing w:before="100" w:beforeAutospacing="1" w:after="100" w:afterAutospacing="1" w:line="240" w:lineRule="auto"/>
+        <w:rPr>
+          <w:rFonts w:ascii="Times New Roman" w:eastAsia="Times New Roman" w:hAnsi="Times New Roman" w:cs="Times New Roman"/>
+          <w:kern w:val="0"/>
+          <w:lang w:eastAsia="en-IN"/>
+          <w14:ligatures w14:val="none"/>
+        </w:rPr>
+      </w:pPr>
+      <w:r>
+        <w:rPr>
+          <w:rFonts w:ascii="Times New Roman" w:eastAsia="Times New Roman" w:hAnsi="Times New Roman" w:cs="Times New Roman"/>
+          <w:kern w:val="0"/>
+          <w:lang w:eastAsia="en-IN"/>
+          <w14:ligatures w14:val="none"/>
+        </w:rPr>
+        <w:t>The chatbot understands user inputs, matches them with predefined knowledge categories, and generates appropriate responses. If the chatbot does not understand a query, it provides a fallback message guiding the user.</w:t>
+      </w:r>
+    </w:p>
+    <w:p>
+      <w:pPr>
+        <w:spacing w:after="0" w:line="240" w:lineRule="auto"/>
+        <w:rPr>
+          <w:rFonts w:ascii="Times New Roman" w:eastAsia="Times New Roman" w:hAnsi="Times New Roman" w:cs="Times New Roman"/>
+          <w:kern w:val="0"/>
+          <w:lang w:eastAsia="en-IN"/>
+          <w14:ligatures w14:val="none"/>
+        </w:rPr>
+      </w:pPr>
+      <w:r>
+        <w:rPr>
+          <w:rFonts w:ascii="Times New Roman" w:eastAsia="Times New Roman" w:hAnsi="Times New Roman" w:cs="Times New Roman"/>
+          <w:kern w:val="0"/>
+          <w:lang w:eastAsia="en-IN"/>
+          <w14:ligatures w14:val="none"/>
+        </w:rPr>
+        <w:pict w14:anchorId="68830FDF">
+          <v:rect id="_x0000_i1026" style="width:0;height:1.5pt" o:hralign="center" o:hrstd="t" o:hr="t" fillcolor="#a0a0a0" stroked="f"/>
+        </w:pict>
+      </w:r>
+    </w:p>
+    <w:p>
+      <w:pPr>
+        <w:spacing w:before="100" w:beforeAutospacing="1" w:after="100" w:afterAutospacing="1" w:line="240" w:lineRule="auto"/>
+        <w:outlineLvl w:val="0"/>
         <w:rPr>
           <w:rFonts w:ascii="Times New Roman" w:eastAsia="Times New Roman" w:hAnsi="Times New Roman" w:cs="Times New Roman"/>
           <w:b/>
@@ -43,511 +499,8 @@
           <w:lang w:eastAsia="en-IN"/>
           <w14:ligatures w14:val="none"/>
         </w:rPr>
-        <w:t xml:space="preserve"> – AI Campus Assistant Chatbot</w:t>
-      </w:r>
-    </w:p>
-    <w:p>
-      <w:pPr>
-        <w:spacing w:before="100" w:beforeAutospacing="1" w:after="100" w:afterAutospacing="1" w:line="240" w:lineRule="auto"/>
-        <w:outlineLvl w:val="1"/>
-        <w:rPr>
-          <w:rFonts w:ascii="Times New Roman" w:eastAsia="Times New Roman" w:hAnsi="Times New Roman" w:cs="Times New Roman"/>
-          <w:b/>
-          <w:bCs/>
-          <w:kern w:val="0"/>
-          <w:sz w:val="36"/>
-          <w:szCs w:val="36"/>
-          <w:lang w:eastAsia="en-IN"/>
-          <w14:ligatures w14:val="none"/>
-        </w:rPr>
-      </w:pPr>
-      <w:r>
-        <w:rPr>
-          <w:rFonts w:ascii="Times New Roman" w:eastAsia="Times New Roman" w:hAnsi="Times New Roman" w:cs="Times New Roman"/>
-          <w:b/>
-          <w:bCs/>
-          <w:kern w:val="0"/>
-          <w:sz w:val="36"/>
-          <w:szCs w:val="36"/>
-          <w:lang w:eastAsia="en-IN"/>
-          <w14:ligatures w14:val="none"/>
-        </w:rPr>
-        <w:t>1. Project Title</w:t>
-      </w:r>
-    </w:p>
-    <w:p>
-      <w:pPr>
-        <w:spacing w:before="100" w:beforeAutospacing="1" w:after="100" w:afterAutospacing="1" w:line="240" w:lineRule="auto"/>
-        <w:rPr>
-          <w:rFonts w:ascii="Times New Roman" w:eastAsia="Times New Roman" w:hAnsi="Times New Roman" w:cs="Times New Roman"/>
-          <w:kern w:val="0"/>
-          <w:lang w:eastAsia="en-IN"/>
-          <w14:ligatures w14:val="none"/>
-        </w:rPr>
-      </w:pPr>
-      <w:proofErr w:type="spellStart"/>
-      <w:r>
-        <w:rPr>
-          <w:rFonts w:ascii="Times New Roman" w:eastAsia="Times New Roman" w:hAnsi="Times New Roman" w:cs="Times New Roman"/>
-          <w:b/>
-          <w:bCs/>
-          <w:kern w:val="0"/>
-          <w:lang w:eastAsia="en-IN"/>
-          <w14:ligatures w14:val="none"/>
-        </w:rPr>
-        <w:t>CampusBot</w:t>
-      </w:r>
-      <w:proofErr w:type="spellEnd"/>
-      <w:r>
-        <w:rPr>
-          <w:rFonts w:ascii="Times New Roman" w:eastAsia="Times New Roman" w:hAnsi="Times New Roman" w:cs="Times New Roman"/>
-          <w:b/>
-          <w:bCs/>
-          <w:kern w:val="0"/>
-          <w:lang w:eastAsia="en-IN"/>
-          <w14:ligatures w14:val="none"/>
-        </w:rPr>
-        <w:t xml:space="preserve"> – AI Powered Campus Assistant Chatbot</w:t>
-      </w:r>
-    </w:p>
-    <w:p>
-      <w:pPr>
-        <w:spacing w:after="0" w:line="240" w:lineRule="auto"/>
-        <w:rPr>
-          <w:rFonts w:ascii="Times New Roman" w:eastAsia="Times New Roman" w:hAnsi="Times New Roman" w:cs="Times New Roman"/>
-          <w:kern w:val="0"/>
-          <w:lang w:eastAsia="en-IN"/>
-          <w14:ligatures w14:val="none"/>
-        </w:rPr>
-      </w:pPr>
-      <w:r>
-        <w:rPr>
-          <w:rFonts w:ascii="Times New Roman" w:eastAsia="Times New Roman" w:hAnsi="Times New Roman" w:cs="Times New Roman"/>
-          <w:kern w:val="0"/>
-          <w:lang w:eastAsia="en-IN"/>
-          <w14:ligatures w14:val="none"/>
-        </w:rPr>
-        <w:pict w14:anchorId="5E1BB888">
-          <v:rect id="_x0000_i1025" style="width:0;height:1.5pt" o:hralign="center" o:hrstd="t" o:hr="t" fillcolor="#a0a0a0" stroked="f"/>
-        </w:pict>
-      </w:r>
-    </w:p>
-    <w:p>
-      <w:pPr>
-        <w:spacing w:before="100" w:beforeAutospacing="1" w:after="100" w:afterAutospacing="1" w:line="240" w:lineRule="auto"/>
-        <w:outlineLvl w:val="1"/>
-        <w:rPr>
-          <w:rFonts w:ascii="Times New Roman" w:eastAsia="Times New Roman" w:hAnsi="Times New Roman" w:cs="Times New Roman"/>
-          <w:b/>
-          <w:bCs/>
-          <w:kern w:val="0"/>
-          <w:sz w:val="36"/>
-          <w:szCs w:val="36"/>
-          <w:lang w:eastAsia="en-IN"/>
-          <w14:ligatures w14:val="none"/>
-        </w:rPr>
-      </w:pPr>
-      <w:r>
-        <w:rPr>
-          <w:rFonts w:ascii="Times New Roman" w:eastAsia="Times New Roman" w:hAnsi="Times New Roman" w:cs="Times New Roman"/>
-          <w:b/>
-          <w:bCs/>
-          <w:kern w:val="0"/>
-          <w:sz w:val="36"/>
-          <w:szCs w:val="36"/>
-          <w:lang w:eastAsia="en-IN"/>
-          <w14:ligatures w14:val="none"/>
-        </w:rPr>
-        <w:t>2. Project Objective &amp; Description</w:t>
-      </w:r>
-    </w:p>
-    <w:p>
-      <w:pPr>
-        <w:spacing w:before="100" w:beforeAutospacing="1" w:after="100" w:afterAutospacing="1" w:line="240" w:lineRule="auto"/>
-        <w:outlineLvl w:val="2"/>
-        <w:rPr>
-          <w:rFonts w:ascii="Times New Roman" w:eastAsia="Times New Roman" w:hAnsi="Times New Roman" w:cs="Times New Roman"/>
-          <w:b/>
-          <w:bCs/>
-          <w:kern w:val="0"/>
-          <w:sz w:val="27"/>
-          <w:szCs w:val="27"/>
-          <w:lang w:eastAsia="en-IN"/>
-          <w14:ligatures w14:val="none"/>
-        </w:rPr>
-      </w:pPr>
-      <w:r>
-        <w:rPr>
-          <w:rFonts w:ascii="Times New Roman" w:eastAsia="Times New Roman" w:hAnsi="Times New Roman" w:cs="Times New Roman"/>
-          <w:b/>
-          <w:bCs/>
-          <w:kern w:val="0"/>
-          <w:sz w:val="27"/>
-          <w:szCs w:val="27"/>
-          <w:lang w:eastAsia="en-IN"/>
-          <w14:ligatures w14:val="none"/>
-        </w:rPr>
-        <w:t>Objective:</w:t>
-      </w:r>
-    </w:p>
-    <w:p>
-      <w:pPr>
-        <w:spacing w:before="100" w:beforeAutospacing="1" w:after="100" w:afterAutospacing="1" w:line="240" w:lineRule="auto"/>
-        <w:rPr>
-          <w:rFonts w:ascii="Times New Roman" w:eastAsia="Times New Roman" w:hAnsi="Times New Roman" w:cs="Times New Roman"/>
-          <w:kern w:val="0"/>
-          <w:lang w:eastAsia="en-IN"/>
-          <w14:ligatures w14:val="none"/>
-        </w:rPr>
-      </w:pPr>
-      <w:r>
-        <w:rPr>
-          <w:rFonts w:ascii="Times New Roman" w:eastAsia="Times New Roman" w:hAnsi="Times New Roman" w:cs="Times New Roman"/>
-          <w:kern w:val="0"/>
-          <w:lang w:eastAsia="en-IN"/>
-          <w14:ligatures w14:val="none"/>
-        </w:rPr>
-        <w:t xml:space="preserve">The objective of </w:t>
-      </w:r>
-      <w:proofErr w:type="spellStart"/>
-      <w:r>
-        <w:rPr>
-          <w:rFonts w:ascii="Times New Roman" w:eastAsia="Times New Roman" w:hAnsi="Times New Roman" w:cs="Times New Roman"/>
-          <w:kern w:val="0"/>
-          <w:lang w:eastAsia="en-IN"/>
-          <w14:ligatures w14:val="none"/>
-        </w:rPr>
-        <w:t>CampusBot</w:t>
-      </w:r>
-      <w:proofErr w:type="spellEnd"/>
-      <w:r>
-        <w:rPr>
-          <w:rFonts w:ascii="Times New Roman" w:eastAsia="Times New Roman" w:hAnsi="Times New Roman" w:cs="Times New Roman"/>
-          <w:kern w:val="0"/>
-          <w:lang w:eastAsia="en-IN"/>
-          <w14:ligatures w14:val="none"/>
-        </w:rPr>
-        <w:t xml:space="preserve"> is to develop an interactive chatbot that helps students, faculty, and visitors get quick answers related to campus services.</w:t>
-      </w:r>
-    </w:p>
-    <w:p>
-      <w:pPr>
-        <w:spacing w:before="100" w:beforeAutospacing="1" w:after="100" w:afterAutospacing="1" w:line="240" w:lineRule="auto"/>
-        <w:rPr>
-          <w:rFonts w:ascii="Times New Roman" w:eastAsia="Times New Roman" w:hAnsi="Times New Roman" w:cs="Times New Roman"/>
-          <w:kern w:val="0"/>
-          <w:lang w:eastAsia="en-IN"/>
-          <w14:ligatures w14:val="none"/>
-        </w:rPr>
-      </w:pPr>
-      <w:r>
-        <w:rPr>
-          <w:rFonts w:ascii="Times New Roman" w:eastAsia="Times New Roman" w:hAnsi="Times New Roman" w:cs="Times New Roman"/>
-          <w:kern w:val="0"/>
-          <w:lang w:eastAsia="en-IN"/>
-          <w14:ligatures w14:val="none"/>
-        </w:rPr>
-        <w:t>The chatbot reduces the need for manually searching information by providing instant automated responses.</w:t>
-      </w:r>
-    </w:p>
-    <w:p>
-      <w:pPr>
-        <w:spacing w:before="100" w:beforeAutospacing="1" w:after="100" w:afterAutospacing="1" w:line="240" w:lineRule="auto"/>
-        <w:outlineLvl w:val="2"/>
-        <w:rPr>
-          <w:rFonts w:ascii="Times New Roman" w:eastAsia="Times New Roman" w:hAnsi="Times New Roman" w:cs="Times New Roman"/>
-          <w:b/>
-          <w:bCs/>
-          <w:kern w:val="0"/>
-          <w:sz w:val="27"/>
-          <w:szCs w:val="27"/>
-          <w:lang w:eastAsia="en-IN"/>
-          <w14:ligatures w14:val="none"/>
-        </w:rPr>
-      </w:pPr>
-      <w:r>
-        <w:rPr>
-          <w:rFonts w:ascii="Times New Roman" w:eastAsia="Times New Roman" w:hAnsi="Times New Roman" w:cs="Times New Roman"/>
-          <w:b/>
-          <w:bCs/>
-          <w:kern w:val="0"/>
-          <w:sz w:val="27"/>
-          <w:szCs w:val="27"/>
-          <w:lang w:eastAsia="en-IN"/>
-          <w14:ligatures w14:val="none"/>
-        </w:rPr>
-        <w:t>Description:</w:t>
-      </w:r>
-    </w:p>
-    <w:p>
-      <w:pPr>
-        <w:spacing w:before="100" w:beforeAutospacing="1" w:after="100" w:afterAutospacing="1" w:line="240" w:lineRule="auto"/>
-        <w:rPr>
-          <w:rFonts w:ascii="Times New Roman" w:eastAsia="Times New Roman" w:hAnsi="Times New Roman" w:cs="Times New Roman"/>
-          <w:kern w:val="0"/>
-          <w:lang w:eastAsia="en-IN"/>
-          <w14:ligatures w14:val="none"/>
-        </w:rPr>
-      </w:pPr>
-      <w:proofErr w:type="spellStart"/>
-      <w:r>
-        <w:rPr>
-          <w:rFonts w:ascii="Times New Roman" w:eastAsia="Times New Roman" w:hAnsi="Times New Roman" w:cs="Times New Roman"/>
-          <w:kern w:val="0"/>
-          <w:lang w:eastAsia="en-IN"/>
-          <w14:ligatures w14:val="none"/>
-        </w:rPr>
-        <w:t>CampusBot</w:t>
-      </w:r>
-      <w:proofErr w:type="spellEnd"/>
-      <w:r>
-        <w:rPr>
-          <w:rFonts w:ascii="Times New Roman" w:eastAsia="Times New Roman" w:hAnsi="Times New Roman" w:cs="Times New Roman"/>
-          <w:kern w:val="0"/>
-          <w:lang w:eastAsia="en-IN"/>
-          <w14:ligatures w14:val="none"/>
-        </w:rPr>
-        <w:t xml:space="preserve"> is a university assistant chatbot designed to answer common student queries. It provides information about:</w:t>
-      </w:r>
-    </w:p>
-    <w:p>
-      <w:pPr>
-        <w:numPr>
-          <w:ilvl w:val="0"/>
-          <w:numId w:val="1"/>
-        </w:numPr>
-        <w:spacing w:before="100" w:beforeAutospacing="1" w:after="100" w:afterAutospacing="1" w:line="240" w:lineRule="auto"/>
-        <w:rPr>
-          <w:rFonts w:ascii="Times New Roman" w:eastAsia="Times New Roman" w:hAnsi="Times New Roman" w:cs="Times New Roman"/>
-          <w:kern w:val="0"/>
-          <w:lang w:eastAsia="en-IN"/>
-          <w14:ligatures w14:val="none"/>
-        </w:rPr>
-      </w:pPr>
-      <w:r>
-        <w:rPr>
-          <w:rFonts w:ascii="Times New Roman" w:eastAsia="Times New Roman" w:hAnsi="Times New Roman" w:cs="Times New Roman"/>
-          <w:kern w:val="0"/>
-          <w:lang w:eastAsia="en-IN"/>
-          <w14:ligatures w14:val="none"/>
-        </w:rPr>
-        <w:t>Admissions</w:t>
-      </w:r>
-    </w:p>
-    <w:p>
-      <w:pPr>
-        <w:numPr>
-          <w:ilvl w:val="0"/>
-          <w:numId w:val="1"/>
-        </w:numPr>
-        <w:spacing w:before="100" w:beforeAutospacing="1" w:after="100" w:afterAutospacing="1" w:line="240" w:lineRule="auto"/>
-        <w:rPr>
-          <w:rFonts w:ascii="Times New Roman" w:eastAsia="Times New Roman" w:hAnsi="Times New Roman" w:cs="Times New Roman"/>
-          <w:kern w:val="0"/>
-          <w:lang w:eastAsia="en-IN"/>
-          <w14:ligatures w14:val="none"/>
-        </w:rPr>
-      </w:pPr>
-      <w:r>
-        <w:rPr>
-          <w:rFonts w:ascii="Times New Roman" w:eastAsia="Times New Roman" w:hAnsi="Times New Roman" w:cs="Times New Roman"/>
-          <w:kern w:val="0"/>
-          <w:lang w:eastAsia="en-IN"/>
-          <w14:ligatures w14:val="none"/>
-        </w:rPr>
-        <w:t>Library facilities</w:t>
-      </w:r>
-    </w:p>
-    <w:p>
-      <w:pPr>
-        <w:numPr>
-          <w:ilvl w:val="0"/>
-          <w:numId w:val="1"/>
-        </w:numPr>
-        <w:spacing w:before="100" w:beforeAutospacing="1" w:after="100" w:afterAutospacing="1" w:line="240" w:lineRule="auto"/>
-        <w:rPr>
-          <w:rFonts w:ascii="Times New Roman" w:eastAsia="Times New Roman" w:hAnsi="Times New Roman" w:cs="Times New Roman"/>
-          <w:kern w:val="0"/>
-          <w:lang w:eastAsia="en-IN"/>
-          <w14:ligatures w14:val="none"/>
-        </w:rPr>
-      </w:pPr>
-      <w:r>
-        <w:rPr>
-          <w:rFonts w:ascii="Times New Roman" w:eastAsia="Times New Roman" w:hAnsi="Times New Roman" w:cs="Times New Roman"/>
-          <w:kern w:val="0"/>
-          <w:lang w:eastAsia="en-IN"/>
-          <w14:ligatures w14:val="none"/>
-        </w:rPr>
-        <w:t>Fee structure</w:t>
-      </w:r>
-    </w:p>
-    <w:p>
-      <w:pPr>
-        <w:numPr>
-          <w:ilvl w:val="0"/>
-          <w:numId w:val="1"/>
-        </w:numPr>
-        <w:spacing w:before="100" w:beforeAutospacing="1" w:after="100" w:afterAutospacing="1" w:line="240" w:lineRule="auto"/>
-        <w:rPr>
-          <w:rFonts w:ascii="Times New Roman" w:eastAsia="Times New Roman" w:hAnsi="Times New Roman" w:cs="Times New Roman"/>
-          <w:kern w:val="0"/>
-          <w:lang w:eastAsia="en-IN"/>
-          <w14:ligatures w14:val="none"/>
-        </w:rPr>
-      </w:pPr>
-      <w:r>
-        <w:rPr>
-          <w:rFonts w:ascii="Times New Roman" w:eastAsia="Times New Roman" w:hAnsi="Times New Roman" w:cs="Times New Roman"/>
-          <w:kern w:val="0"/>
-          <w:lang w:eastAsia="en-IN"/>
-          <w14:ligatures w14:val="none"/>
-        </w:rPr>
-        <w:t>Examination schedules</w:t>
-      </w:r>
-    </w:p>
-    <w:p>
-      <w:pPr>
-        <w:numPr>
-          <w:ilvl w:val="0"/>
-          <w:numId w:val="1"/>
-        </w:numPr>
-        <w:spacing w:before="100" w:beforeAutospacing="1" w:after="100" w:afterAutospacing="1" w:line="240" w:lineRule="auto"/>
-        <w:rPr>
-          <w:rFonts w:ascii="Times New Roman" w:eastAsia="Times New Roman" w:hAnsi="Times New Roman" w:cs="Times New Roman"/>
-          <w:kern w:val="0"/>
-          <w:lang w:eastAsia="en-IN"/>
-          <w14:ligatures w14:val="none"/>
-        </w:rPr>
-      </w:pPr>
-      <w:r>
-        <w:rPr>
-          <w:rFonts w:ascii="Times New Roman" w:eastAsia="Times New Roman" w:hAnsi="Times New Roman" w:cs="Times New Roman"/>
-          <w:kern w:val="0"/>
-          <w:lang w:eastAsia="en-IN"/>
-          <w14:ligatures w14:val="none"/>
-        </w:rPr>
-        <w:t>Hostel accommodation</w:t>
-      </w:r>
-    </w:p>
-    <w:p>
-      <w:pPr>
-        <w:numPr>
-          <w:ilvl w:val="0"/>
-          <w:numId w:val="1"/>
-        </w:numPr>
-        <w:spacing w:before="100" w:beforeAutospacing="1" w:after="100" w:afterAutospacing="1" w:line="240" w:lineRule="auto"/>
-        <w:rPr>
-          <w:rFonts w:ascii="Times New Roman" w:eastAsia="Times New Roman" w:hAnsi="Times New Roman" w:cs="Times New Roman"/>
-          <w:kern w:val="0"/>
-          <w:lang w:eastAsia="en-IN"/>
-          <w14:ligatures w14:val="none"/>
-        </w:rPr>
-      </w:pPr>
-      <w:r>
-        <w:rPr>
-          <w:rFonts w:ascii="Times New Roman" w:eastAsia="Times New Roman" w:hAnsi="Times New Roman" w:cs="Times New Roman"/>
-          <w:kern w:val="0"/>
-          <w:lang w:eastAsia="en-IN"/>
-          <w14:ligatures w14:val="none"/>
-        </w:rPr>
-        <w:t>Placement information</w:t>
-      </w:r>
-    </w:p>
-    <w:p>
-      <w:pPr>
-        <w:numPr>
-          <w:ilvl w:val="0"/>
-          <w:numId w:val="1"/>
-        </w:numPr>
-        <w:spacing w:before="100" w:beforeAutospacing="1" w:after="100" w:afterAutospacing="1" w:line="240" w:lineRule="auto"/>
-        <w:rPr>
-          <w:rFonts w:ascii="Times New Roman" w:eastAsia="Times New Roman" w:hAnsi="Times New Roman" w:cs="Times New Roman"/>
-          <w:kern w:val="0"/>
-          <w:lang w:eastAsia="en-IN"/>
-          <w14:ligatures w14:val="none"/>
-        </w:rPr>
-      </w:pPr>
-      <w:r>
-        <w:rPr>
-          <w:rFonts w:ascii="Times New Roman" w:eastAsia="Times New Roman" w:hAnsi="Times New Roman" w:cs="Times New Roman"/>
-          <w:kern w:val="0"/>
-          <w:lang w:eastAsia="en-IN"/>
-          <w14:ligatures w14:val="none"/>
-        </w:rPr>
-        <w:t>Campus events</w:t>
-      </w:r>
-    </w:p>
-    <w:p>
-      <w:pPr>
-        <w:numPr>
-          <w:ilvl w:val="0"/>
-          <w:numId w:val="1"/>
-        </w:numPr>
-        <w:spacing w:before="100" w:beforeAutospacing="1" w:after="100" w:afterAutospacing="1" w:line="240" w:lineRule="auto"/>
-        <w:rPr>
-          <w:rFonts w:ascii="Times New Roman" w:eastAsia="Times New Roman" w:hAnsi="Times New Roman" w:cs="Times New Roman"/>
-          <w:kern w:val="0"/>
-          <w:lang w:eastAsia="en-IN"/>
-          <w14:ligatures w14:val="none"/>
-        </w:rPr>
-      </w:pPr>
-      <w:r>
-        <w:rPr>
-          <w:rFonts w:ascii="Times New Roman" w:eastAsia="Times New Roman" w:hAnsi="Times New Roman" w:cs="Times New Roman"/>
-          <w:kern w:val="0"/>
-          <w:lang w:eastAsia="en-IN"/>
-          <w14:ligatures w14:val="none"/>
-        </w:rPr>
-        <w:t>Contact details</w:t>
-      </w:r>
-    </w:p>
-    <w:p>
-      <w:pPr>
-        <w:spacing w:before="100" w:beforeAutospacing="1" w:after="100" w:afterAutospacing="1" w:line="240" w:lineRule="auto"/>
-        <w:rPr>
-          <w:rFonts w:ascii="Times New Roman" w:eastAsia="Times New Roman" w:hAnsi="Times New Roman" w:cs="Times New Roman"/>
-          <w:kern w:val="0"/>
-          <w:lang w:eastAsia="en-IN"/>
-          <w14:ligatures w14:val="none"/>
-        </w:rPr>
-      </w:pPr>
-      <w:r>
-        <w:rPr>
-          <w:rFonts w:ascii="Times New Roman" w:eastAsia="Times New Roman" w:hAnsi="Times New Roman" w:cs="Times New Roman"/>
-          <w:kern w:val="0"/>
-          <w:lang w:eastAsia="en-IN"/>
-          <w14:ligatures w14:val="none"/>
-        </w:rPr>
-        <w:t>The chatbot understands user inputs, matches them with predefined knowledge categories, and generates appropriate responses. If the chatbot does not understand a query, it provides a fallback message guiding the user.</w:t>
-      </w:r>
-    </w:p>
-    <w:p>
-      <w:pPr>
-        <w:spacing w:after="0" w:line="240" w:lineRule="auto"/>
-        <w:rPr>
-          <w:rFonts w:ascii="Times New Roman" w:eastAsia="Times New Roman" w:hAnsi="Times New Roman" w:cs="Times New Roman"/>
-          <w:kern w:val="0"/>
-          <w:lang w:eastAsia="en-IN"/>
-          <w14:ligatures w14:val="none"/>
-        </w:rPr>
-      </w:pPr>
-      <w:r>
-        <w:rPr>
-          <w:rFonts w:ascii="Times New Roman" w:eastAsia="Times New Roman" w:hAnsi="Times New Roman" w:cs="Times New Roman"/>
-          <w:kern w:val="0"/>
-          <w:lang w:eastAsia="en-IN"/>
-          <w14:ligatures w14:val="none"/>
-        </w:rPr>
-        <w:pict w14:anchorId="68830FDF">
-          <v:rect id="_x0000_i1026" style="width:0;height:1.5pt" o:hralign="center" o:hrstd="t" o:hr="t" fillcolor="#a0a0a0" stroked="f"/>
-        </w:pict>
-      </w:r>
-    </w:p>
-    <w:p>
-      <w:pPr>
-        <w:spacing w:before="100" w:beforeAutospacing="1" w:after="100" w:afterAutospacing="1" w:line="240" w:lineRule="auto"/>
-        <w:outlineLvl w:val="0"/>
+      </w:pPr>
+      <w:r>
         <w:rPr>
           <w:rFonts w:ascii="Times New Roman" w:eastAsia="Times New Roman" w:hAnsi="Times New Roman" w:cs="Times New Roman"/>
           <w:b/>
@@ -558,8 +511,544 @@
           <w:lang w:eastAsia="en-IN"/>
           <w14:ligatures w14:val="none"/>
         </w:rPr>
-      </w:pPr>
-      <w:r>
+        <w:t>3. Technologies Used</w:t>
+      </w:r>
+    </w:p>
+    <w:p>
+      <w:pPr>
+        <w:spacing w:before="100" w:beforeAutospacing="1" w:after="100" w:afterAutospacing="1" w:line="240" w:lineRule="auto"/>
+        <w:outlineLvl w:val="2"/>
+        <w:rPr>
+          <w:rFonts w:ascii="Times New Roman" w:eastAsia="Times New Roman" w:hAnsi="Times New Roman" w:cs="Times New Roman"/>
+          <w:b/>
+          <w:bCs/>
+          <w:kern w:val="0"/>
+          <w:sz w:val="27"/>
+          <w:szCs w:val="27"/>
+          <w:lang w:eastAsia="en-IN"/>
+          <w14:ligatures w14:val="none"/>
+        </w:rPr>
+      </w:pPr>
+      <w:r>
+        <w:rPr>
+          <w:rFonts w:ascii="Times New Roman" w:eastAsia="Times New Roman" w:hAnsi="Times New Roman" w:cs="Times New Roman"/>
+          <w:b/>
+          <w:bCs/>
+          <w:kern w:val="0"/>
+          <w:sz w:val="27"/>
+          <w:szCs w:val="27"/>
+          <w:lang w:eastAsia="en-IN"/>
+          <w14:ligatures w14:val="none"/>
+        </w:rPr>
+        <w:t>HTML</w:t>
+      </w:r>
+    </w:p>
+    <w:p>
+      <w:pPr>
+        <w:spacing w:before="100" w:beforeAutospacing="1" w:after="100" w:afterAutospacing="1" w:line="240" w:lineRule="auto"/>
+        <w:rPr>
+          <w:rFonts w:ascii="Times New Roman" w:eastAsia="Times New Roman" w:hAnsi="Times New Roman" w:cs="Times New Roman"/>
+          <w:kern w:val="0"/>
+          <w:lang w:eastAsia="en-IN"/>
+          <w14:ligatures w14:val="none"/>
+        </w:rPr>
+      </w:pPr>
+      <w:r>
+        <w:rPr>
+          <w:rFonts w:ascii="Times New Roman" w:eastAsia="Times New Roman" w:hAnsi="Times New Roman" w:cs="Times New Roman"/>
+          <w:kern w:val="0"/>
+          <w:lang w:eastAsia="en-IN"/>
+          <w14:ligatures w14:val="none"/>
+        </w:rPr>
+        <w:t>Used for creating the chatbot interface structure including:</w:t>
+      </w:r>
+    </w:p>
+    <w:p>
+      <w:pPr>
+        <w:numPr>
+          <w:ilvl w:val="0"/>
+          <w:numId w:val="2"/>
+        </w:numPr>
+        <w:spacing w:before="100" w:beforeAutospacing="1" w:after="100" w:afterAutospacing="1" w:line="240" w:lineRule="auto"/>
+        <w:rPr>
+          <w:rFonts w:ascii="Times New Roman" w:eastAsia="Times New Roman" w:hAnsi="Times New Roman" w:cs="Times New Roman"/>
+          <w:kern w:val="0"/>
+          <w:lang w:eastAsia="en-IN"/>
+          <w14:ligatures w14:val="none"/>
+        </w:rPr>
+      </w:pPr>
+      <w:r>
+        <w:rPr>
+          <w:rFonts w:ascii="Times New Roman" w:eastAsia="Times New Roman" w:hAnsi="Times New Roman" w:cs="Times New Roman"/>
+          <w:kern w:val="0"/>
+          <w:lang w:eastAsia="en-IN"/>
+          <w14:ligatures w14:val="none"/>
+        </w:rPr>
+        <w:t>Chat window</w:t>
+      </w:r>
+    </w:p>
+    <w:p>
+      <w:pPr>
+        <w:numPr>
+          <w:ilvl w:val="0"/>
+          <w:numId w:val="2"/>
+        </w:numPr>
+        <w:spacing w:before="100" w:beforeAutospacing="1" w:after="100" w:afterAutospacing="1" w:line="240" w:lineRule="auto"/>
+        <w:rPr>
+          <w:rFonts w:ascii="Times New Roman" w:eastAsia="Times New Roman" w:hAnsi="Times New Roman" w:cs="Times New Roman"/>
+          <w:kern w:val="0"/>
+          <w:lang w:eastAsia="en-IN"/>
+          <w14:ligatures w14:val="none"/>
+        </w:rPr>
+      </w:pPr>
+      <w:r>
+        <w:rPr>
+          <w:rFonts w:ascii="Times New Roman" w:eastAsia="Times New Roman" w:hAnsi="Times New Roman" w:cs="Times New Roman"/>
+          <w:kern w:val="0"/>
+          <w:lang w:eastAsia="en-IN"/>
+          <w14:ligatures w14:val="none"/>
+        </w:rPr>
+        <w:t>Input box</w:t>
+      </w:r>
+    </w:p>
+    <w:p>
+      <w:pPr>
+        <w:numPr>
+          <w:ilvl w:val="0"/>
+          <w:numId w:val="2"/>
+        </w:numPr>
+        <w:spacing w:before="100" w:beforeAutospacing="1" w:after="100" w:afterAutospacing="1" w:line="240" w:lineRule="auto"/>
+        <w:rPr>
+          <w:rFonts w:ascii="Times New Roman" w:eastAsia="Times New Roman" w:hAnsi="Times New Roman" w:cs="Times New Roman"/>
+          <w:kern w:val="0"/>
+          <w:lang w:eastAsia="en-IN"/>
+          <w14:ligatures w14:val="none"/>
+        </w:rPr>
+      </w:pPr>
+      <w:r>
+        <w:rPr>
+          <w:rFonts w:ascii="Times New Roman" w:eastAsia="Times New Roman" w:hAnsi="Times New Roman" w:cs="Times New Roman"/>
+          <w:kern w:val="0"/>
+          <w:lang w:eastAsia="en-IN"/>
+          <w14:ligatures w14:val="none"/>
+        </w:rPr>
+        <w:lastRenderedPageBreak/>
+        <w:t>Send button</w:t>
+      </w:r>
+    </w:p>
+    <w:p>
+      <w:pPr>
+        <w:numPr>
+          <w:ilvl w:val="0"/>
+          <w:numId w:val="2"/>
+        </w:numPr>
+        <w:spacing w:before="100" w:beforeAutospacing="1" w:after="100" w:afterAutospacing="1" w:line="240" w:lineRule="auto"/>
+        <w:rPr>
+          <w:rFonts w:ascii="Times New Roman" w:eastAsia="Times New Roman" w:hAnsi="Times New Roman" w:cs="Times New Roman"/>
+          <w:kern w:val="0"/>
+          <w:lang w:eastAsia="en-IN"/>
+          <w14:ligatures w14:val="none"/>
+        </w:rPr>
+      </w:pPr>
+      <w:r>
+        <w:rPr>
+          <w:rFonts w:ascii="Times New Roman" w:eastAsia="Times New Roman" w:hAnsi="Times New Roman" w:cs="Times New Roman"/>
+          <w:kern w:val="0"/>
+          <w:lang w:eastAsia="en-IN"/>
+          <w14:ligatures w14:val="none"/>
+        </w:rPr>
+        <w:t>Message layout</w:t>
+      </w:r>
+    </w:p>
+    <w:p>
+      <w:pPr>
+        <w:spacing w:before="100" w:beforeAutospacing="1" w:after="100" w:afterAutospacing="1" w:line="240" w:lineRule="auto"/>
+        <w:outlineLvl w:val="2"/>
+        <w:rPr>
+          <w:rFonts w:ascii="Times New Roman" w:eastAsia="Times New Roman" w:hAnsi="Times New Roman" w:cs="Times New Roman"/>
+          <w:b/>
+          <w:bCs/>
+          <w:kern w:val="0"/>
+          <w:sz w:val="27"/>
+          <w:szCs w:val="27"/>
+          <w:lang w:eastAsia="en-IN"/>
+          <w14:ligatures w14:val="none"/>
+        </w:rPr>
+      </w:pPr>
+      <w:r>
+        <w:rPr>
+          <w:rFonts w:ascii="Times New Roman" w:eastAsia="Times New Roman" w:hAnsi="Times New Roman" w:cs="Times New Roman"/>
+          <w:b/>
+          <w:bCs/>
+          <w:kern w:val="0"/>
+          <w:sz w:val="27"/>
+          <w:szCs w:val="27"/>
+          <w:lang w:eastAsia="en-IN"/>
+          <w14:ligatures w14:val="none"/>
+        </w:rPr>
+        <w:t>CSS</w:t>
+      </w:r>
+    </w:p>
+    <w:p>
+      <w:pPr>
+        <w:spacing w:before="100" w:beforeAutospacing="1" w:after="100" w:afterAutospacing="1" w:line="240" w:lineRule="auto"/>
+        <w:rPr>
+          <w:rFonts w:ascii="Times New Roman" w:eastAsia="Times New Roman" w:hAnsi="Times New Roman" w:cs="Times New Roman"/>
+          <w:kern w:val="0"/>
+          <w:lang w:eastAsia="en-IN"/>
+          <w14:ligatures w14:val="none"/>
+        </w:rPr>
+      </w:pPr>
+      <w:r>
+        <w:rPr>
+          <w:rFonts w:ascii="Times New Roman" w:eastAsia="Times New Roman" w:hAnsi="Times New Roman" w:cs="Times New Roman"/>
+          <w:kern w:val="0"/>
+          <w:lang w:eastAsia="en-IN"/>
+          <w14:ligatures w14:val="none"/>
+        </w:rPr>
+        <w:t>Used for designing the chatbot UI:</w:t>
+      </w:r>
+    </w:p>
+    <w:p>
+      <w:pPr>
+        <w:numPr>
+          <w:ilvl w:val="0"/>
+          <w:numId w:val="3"/>
+        </w:numPr>
+        <w:spacing w:before="100" w:beforeAutospacing="1" w:after="100" w:afterAutospacing="1" w:line="240" w:lineRule="auto"/>
+        <w:rPr>
+          <w:rFonts w:ascii="Times New Roman" w:eastAsia="Times New Roman" w:hAnsi="Times New Roman" w:cs="Times New Roman"/>
+          <w:kern w:val="0"/>
+          <w:lang w:eastAsia="en-IN"/>
+          <w14:ligatures w14:val="none"/>
+        </w:rPr>
+      </w:pPr>
+      <w:r>
+        <w:rPr>
+          <w:rFonts w:ascii="Times New Roman" w:eastAsia="Times New Roman" w:hAnsi="Times New Roman" w:cs="Times New Roman"/>
+          <w:kern w:val="0"/>
+          <w:lang w:eastAsia="en-IN"/>
+          <w14:ligatures w14:val="none"/>
+        </w:rPr>
+        <w:t>Chat bubbles</w:t>
+      </w:r>
+    </w:p>
+    <w:p>
+      <w:pPr>
+        <w:numPr>
+          <w:ilvl w:val="0"/>
+          <w:numId w:val="3"/>
+        </w:numPr>
+        <w:spacing w:before="100" w:beforeAutospacing="1" w:after="100" w:afterAutospacing="1" w:line="240" w:lineRule="auto"/>
+        <w:rPr>
+          <w:rFonts w:ascii="Times New Roman" w:eastAsia="Times New Roman" w:hAnsi="Times New Roman" w:cs="Times New Roman"/>
+          <w:kern w:val="0"/>
+          <w:lang w:eastAsia="en-IN"/>
+          <w14:ligatures w14:val="none"/>
+        </w:rPr>
+      </w:pPr>
+      <w:r>
+        <w:rPr>
+          <w:rFonts w:ascii="Times New Roman" w:eastAsia="Times New Roman" w:hAnsi="Times New Roman" w:cs="Times New Roman"/>
+          <w:kern w:val="0"/>
+          <w:lang w:eastAsia="en-IN"/>
+          <w14:ligatures w14:val="none"/>
+        </w:rPr>
+        <w:t>Colors and theme</w:t>
+      </w:r>
+    </w:p>
+    <w:p>
+      <w:pPr>
+        <w:numPr>
+          <w:ilvl w:val="0"/>
+          <w:numId w:val="3"/>
+        </w:numPr>
+        <w:spacing w:before="100" w:beforeAutospacing="1" w:after="100" w:afterAutospacing="1" w:line="240" w:lineRule="auto"/>
+        <w:rPr>
+          <w:rFonts w:ascii="Times New Roman" w:eastAsia="Times New Roman" w:hAnsi="Times New Roman" w:cs="Times New Roman"/>
+          <w:kern w:val="0"/>
+          <w:lang w:eastAsia="en-IN"/>
+          <w14:ligatures w14:val="none"/>
+        </w:rPr>
+      </w:pPr>
+      <w:r>
+        <w:rPr>
+          <w:rFonts w:ascii="Times New Roman" w:eastAsia="Times New Roman" w:hAnsi="Times New Roman" w:cs="Times New Roman"/>
+          <w:kern w:val="0"/>
+          <w:lang w:eastAsia="en-IN"/>
+          <w14:ligatures w14:val="none"/>
+        </w:rPr>
+        <w:t>Responsive layout</w:t>
+      </w:r>
+    </w:p>
+    <w:p>
+      <w:pPr>
+        <w:numPr>
+          <w:ilvl w:val="0"/>
+          <w:numId w:val="3"/>
+        </w:numPr>
+        <w:spacing w:before="100" w:beforeAutospacing="1" w:after="100" w:afterAutospacing="1" w:line="240" w:lineRule="auto"/>
+        <w:rPr>
+          <w:rFonts w:ascii="Times New Roman" w:eastAsia="Times New Roman" w:hAnsi="Times New Roman" w:cs="Times New Roman"/>
+          <w:kern w:val="0"/>
+          <w:lang w:eastAsia="en-IN"/>
+          <w14:ligatures w14:val="none"/>
+        </w:rPr>
+      </w:pPr>
+      <w:r>
+        <w:rPr>
+          <w:rFonts w:ascii="Times New Roman" w:eastAsia="Times New Roman" w:hAnsi="Times New Roman" w:cs="Times New Roman"/>
+          <w:kern w:val="0"/>
+          <w:lang w:eastAsia="en-IN"/>
+          <w14:ligatures w14:val="none"/>
+        </w:rPr>
+        <w:t>Buttons and animations</w:t>
+      </w:r>
+    </w:p>
+    <w:p>
+      <w:pPr>
+        <w:spacing w:before="100" w:beforeAutospacing="1" w:after="100" w:afterAutospacing="1" w:line="240" w:lineRule="auto"/>
+        <w:outlineLvl w:val="2"/>
+        <w:rPr>
+          <w:rFonts w:ascii="Times New Roman" w:eastAsia="Times New Roman" w:hAnsi="Times New Roman" w:cs="Times New Roman"/>
+          <w:b/>
+          <w:bCs/>
+          <w:kern w:val="0"/>
+          <w:sz w:val="27"/>
+          <w:szCs w:val="27"/>
+          <w:lang w:eastAsia="en-IN"/>
+          <w14:ligatures w14:val="none"/>
+        </w:rPr>
+      </w:pPr>
+      <w:r>
+        <w:rPr>
+          <w:rFonts w:ascii="Times New Roman" w:eastAsia="Times New Roman" w:hAnsi="Times New Roman" w:cs="Times New Roman"/>
+          <w:b/>
+          <w:bCs/>
+          <w:kern w:val="0"/>
+          <w:sz w:val="27"/>
+          <w:szCs w:val="27"/>
+          <w:lang w:eastAsia="en-IN"/>
+          <w14:ligatures w14:val="none"/>
+        </w:rPr>
+        <w:t>JavaScript</w:t>
+      </w:r>
+    </w:p>
+    <w:p>
+      <w:pPr>
+        <w:spacing w:before="100" w:beforeAutospacing="1" w:after="100" w:afterAutospacing="1" w:line="240" w:lineRule="auto"/>
+        <w:rPr>
+          <w:rFonts w:ascii="Times New Roman" w:eastAsia="Times New Roman" w:hAnsi="Times New Roman" w:cs="Times New Roman"/>
+          <w:kern w:val="0"/>
+          <w:lang w:eastAsia="en-IN"/>
+          <w14:ligatures w14:val="none"/>
+        </w:rPr>
+      </w:pPr>
+      <w:r>
+        <w:rPr>
+          <w:rFonts w:ascii="Times New Roman" w:eastAsia="Times New Roman" w:hAnsi="Times New Roman" w:cs="Times New Roman"/>
+          <w:kern w:val="0"/>
+          <w:lang w:eastAsia="en-IN"/>
+          <w14:ligatures w14:val="none"/>
+        </w:rPr>
+        <w:t>Used for chatbot logic:</w:t>
+      </w:r>
+    </w:p>
+    <w:p>
+      <w:pPr>
+        <w:numPr>
+          <w:ilvl w:val="0"/>
+          <w:numId w:val="4"/>
+        </w:numPr>
+        <w:spacing w:before="100" w:beforeAutospacing="1" w:after="100" w:afterAutospacing="1" w:line="240" w:lineRule="auto"/>
+        <w:rPr>
+          <w:rFonts w:ascii="Times New Roman" w:eastAsia="Times New Roman" w:hAnsi="Times New Roman" w:cs="Times New Roman"/>
+          <w:kern w:val="0"/>
+          <w:lang w:eastAsia="en-IN"/>
+          <w14:ligatures w14:val="none"/>
+        </w:rPr>
+      </w:pPr>
+      <w:r>
+        <w:rPr>
+          <w:rFonts w:ascii="Times New Roman" w:eastAsia="Times New Roman" w:hAnsi="Times New Roman" w:cs="Times New Roman"/>
+          <w:kern w:val="0"/>
+          <w:lang w:eastAsia="en-IN"/>
+          <w14:ligatures w14:val="none"/>
+        </w:rPr>
+        <w:t>Processing user input</w:t>
+      </w:r>
+    </w:p>
+    <w:p>
+      <w:pPr>
+        <w:numPr>
+          <w:ilvl w:val="0"/>
+          <w:numId w:val="4"/>
+        </w:numPr>
+        <w:spacing w:before="100" w:beforeAutospacing="1" w:after="100" w:afterAutospacing="1" w:line="240" w:lineRule="auto"/>
+        <w:rPr>
+          <w:rFonts w:ascii="Times New Roman" w:eastAsia="Times New Roman" w:hAnsi="Times New Roman" w:cs="Times New Roman"/>
+          <w:kern w:val="0"/>
+          <w:lang w:eastAsia="en-IN"/>
+          <w14:ligatures w14:val="none"/>
+        </w:rPr>
+      </w:pPr>
+      <w:r>
+        <w:rPr>
+          <w:rFonts w:ascii="Times New Roman" w:eastAsia="Times New Roman" w:hAnsi="Times New Roman" w:cs="Times New Roman"/>
+          <w:kern w:val="0"/>
+          <w:lang w:eastAsia="en-IN"/>
+          <w14:ligatures w14:val="none"/>
+        </w:rPr>
+        <w:t>Keyword matching</w:t>
+      </w:r>
+    </w:p>
+    <w:p>
+      <w:pPr>
+        <w:numPr>
+          <w:ilvl w:val="0"/>
+          <w:numId w:val="4"/>
+        </w:numPr>
+        <w:spacing w:before="100" w:beforeAutospacing="1" w:after="100" w:afterAutospacing="1" w:line="240" w:lineRule="auto"/>
+        <w:rPr>
+          <w:rFonts w:ascii="Times New Roman" w:eastAsia="Times New Roman" w:hAnsi="Times New Roman" w:cs="Times New Roman"/>
+          <w:kern w:val="0"/>
+          <w:lang w:eastAsia="en-IN"/>
+          <w14:ligatures w14:val="none"/>
+        </w:rPr>
+      </w:pPr>
+      <w:r>
+        <w:rPr>
+          <w:rFonts w:ascii="Times New Roman" w:eastAsia="Times New Roman" w:hAnsi="Times New Roman" w:cs="Times New Roman"/>
+          <w:kern w:val="0"/>
+          <w:lang w:eastAsia="en-IN"/>
+          <w14:ligatures w14:val="none"/>
+        </w:rPr>
+        <w:t>Generating responses</w:t>
+      </w:r>
+    </w:p>
+    <w:p>
+      <w:pPr>
+        <w:numPr>
+          <w:ilvl w:val="0"/>
+          <w:numId w:val="4"/>
+        </w:numPr>
+        <w:spacing w:before="100" w:beforeAutospacing="1" w:after="100" w:afterAutospacing="1" w:line="240" w:lineRule="auto"/>
+        <w:rPr>
+          <w:rFonts w:ascii="Times New Roman" w:eastAsia="Times New Roman" w:hAnsi="Times New Roman" w:cs="Times New Roman"/>
+          <w:kern w:val="0"/>
+          <w:lang w:eastAsia="en-IN"/>
+          <w14:ligatures w14:val="none"/>
+        </w:rPr>
+      </w:pPr>
+      <w:r>
+        <w:rPr>
+          <w:rFonts w:ascii="Times New Roman" w:eastAsia="Times New Roman" w:hAnsi="Times New Roman" w:cs="Times New Roman"/>
+          <w:kern w:val="0"/>
+          <w:lang w:eastAsia="en-IN"/>
+          <w14:ligatures w14:val="none"/>
+        </w:rPr>
+        <w:t>Quick option buttons</w:t>
+      </w:r>
+    </w:p>
+    <w:p>
+      <w:pPr>
+        <w:numPr>
+          <w:ilvl w:val="0"/>
+          <w:numId w:val="4"/>
+        </w:numPr>
+        <w:spacing w:before="100" w:beforeAutospacing="1" w:after="100" w:afterAutospacing="1" w:line="240" w:lineRule="auto"/>
+        <w:rPr>
+          <w:rFonts w:ascii="Times New Roman" w:eastAsia="Times New Roman" w:hAnsi="Times New Roman" w:cs="Times New Roman"/>
+          <w:kern w:val="0"/>
+          <w:lang w:eastAsia="en-IN"/>
+          <w14:ligatures w14:val="none"/>
+        </w:rPr>
+      </w:pPr>
+      <w:r>
+        <w:rPr>
+          <w:rFonts w:ascii="Times New Roman" w:eastAsia="Times New Roman" w:hAnsi="Times New Roman" w:cs="Times New Roman"/>
+          <w:kern w:val="0"/>
+          <w:lang w:eastAsia="en-IN"/>
+          <w14:ligatures w14:val="none"/>
+        </w:rPr>
+        <w:t>Fallback handling</w:t>
+      </w:r>
+    </w:p>
+    <w:p>
+      <w:pPr>
+        <w:spacing w:before="100" w:beforeAutospacing="1" w:after="100" w:afterAutospacing="1" w:line="240" w:lineRule="auto"/>
+        <w:outlineLvl w:val="2"/>
+        <w:rPr>
+          <w:rFonts w:ascii="Times New Roman" w:eastAsia="Times New Roman" w:hAnsi="Times New Roman" w:cs="Times New Roman"/>
+          <w:b/>
+          <w:bCs/>
+          <w:kern w:val="0"/>
+          <w:sz w:val="27"/>
+          <w:szCs w:val="27"/>
+          <w:lang w:eastAsia="en-IN"/>
+          <w14:ligatures w14:val="none"/>
+        </w:rPr>
+      </w:pPr>
+      <w:r>
+        <w:rPr>
+          <w:rFonts w:ascii="Times New Roman" w:eastAsia="Times New Roman" w:hAnsi="Times New Roman" w:cs="Times New Roman"/>
+          <w:b/>
+          <w:bCs/>
+          <w:kern w:val="0"/>
+          <w:sz w:val="27"/>
+          <w:szCs w:val="27"/>
+          <w:lang w:eastAsia="en-IN"/>
+          <w14:ligatures w14:val="none"/>
+        </w:rPr>
+        <w:t>Knowledge Base Logic</w:t>
+      </w:r>
+    </w:p>
+    <w:p>
+      <w:pPr>
+        <w:spacing w:before="100" w:beforeAutospacing="1" w:after="100" w:afterAutospacing="1" w:line="240" w:lineRule="auto"/>
+        <w:rPr>
+          <w:rFonts w:ascii="Times New Roman" w:eastAsia="Times New Roman" w:hAnsi="Times New Roman" w:cs="Times New Roman"/>
+          <w:kern w:val="0"/>
+          <w:lang w:eastAsia="en-IN"/>
+          <w14:ligatures w14:val="none"/>
+        </w:rPr>
+      </w:pPr>
+      <w:r>
+        <w:rPr>
+          <w:rFonts w:ascii="Times New Roman" w:eastAsia="Times New Roman" w:hAnsi="Times New Roman" w:cs="Times New Roman"/>
+          <w:kern w:val="0"/>
+          <w:lang w:eastAsia="en-IN"/>
+          <w14:ligatures w14:val="none"/>
+        </w:rPr>
+        <w:t>A rule-based chatbot approach was implemented where keywords are mapped with predefined responses.</w:t>
+      </w:r>
+    </w:p>
+    <w:p>
+      <w:pPr>
+        <w:spacing w:after="0" w:line="240" w:lineRule="auto"/>
+        <w:rPr>
+          <w:rFonts w:ascii="Times New Roman" w:eastAsia="Times New Roman" w:hAnsi="Times New Roman" w:cs="Times New Roman"/>
+          <w:kern w:val="0"/>
+          <w:lang w:eastAsia="en-IN"/>
+          <w14:ligatures w14:val="none"/>
+        </w:rPr>
+      </w:pPr>
+      <w:r>
+        <w:rPr>
+          <w:rFonts w:ascii="Times New Roman" w:eastAsia="Times New Roman" w:hAnsi="Times New Roman" w:cs="Times New Roman"/>
+          <w:kern w:val="0"/>
+          <w:lang w:eastAsia="en-IN"/>
+          <w14:ligatures w14:val="none"/>
+        </w:rPr>
+        <w:pict w14:anchorId="0704CF62">
+          <v:rect id="_x0000_i1027" style="width:0;height:1.5pt" o:hralign="center" o:hrstd="t" o:hr="t" fillcolor="#a0a0a0" stroked="f"/>
+        </w:pict>
+      </w:r>
+    </w:p>
+    <w:p>
+      <w:pPr>
+        <w:spacing w:before="100" w:beforeAutospacing="1" w:after="100" w:afterAutospacing="1" w:line="240" w:lineRule="auto"/>
+        <w:outlineLvl w:val="0"/>
         <w:rPr>
           <w:rFonts w:ascii="Times New Roman" w:eastAsia="Times New Roman" w:hAnsi="Times New Roman" w:cs="Times New Roman"/>
           <w:b/>
@@ -570,555 +1059,8 @@
           <w:lang w:eastAsia="en-IN"/>
           <w14:ligatures w14:val="none"/>
         </w:rPr>
-        <w:t>3. Technologies Used</w:t>
-      </w:r>
-    </w:p>
-    <w:p>
-      <w:pPr>
-        <w:spacing w:before="100" w:beforeAutospacing="1" w:after="100" w:afterAutospacing="1" w:line="240" w:lineRule="auto"/>
-        <w:outlineLvl w:val="2"/>
-        <w:rPr>
-          <w:rFonts w:ascii="Times New Roman" w:eastAsia="Times New Roman" w:hAnsi="Times New Roman" w:cs="Times New Roman"/>
-          <w:b/>
-          <w:bCs/>
-          <w:kern w:val="0"/>
-          <w:sz w:val="27"/>
-          <w:szCs w:val="27"/>
-          <w:lang w:eastAsia="en-IN"/>
-          <w14:ligatures w14:val="none"/>
-        </w:rPr>
-      </w:pPr>
-      <w:r>
-        <w:rPr>
-          <w:rFonts w:ascii="Times New Roman" w:eastAsia="Times New Roman" w:hAnsi="Times New Roman" w:cs="Times New Roman"/>
-          <w:b/>
-          <w:bCs/>
-          <w:kern w:val="0"/>
-          <w:sz w:val="27"/>
-          <w:szCs w:val="27"/>
-          <w:lang w:eastAsia="en-IN"/>
-          <w14:ligatures w14:val="none"/>
-        </w:rPr>
-        <w:t>HTML</w:t>
-      </w:r>
-    </w:p>
-    <w:p>
-      <w:pPr>
-        <w:spacing w:before="100" w:beforeAutospacing="1" w:after="100" w:afterAutospacing="1" w:line="240" w:lineRule="auto"/>
-        <w:rPr>
-          <w:rFonts w:ascii="Times New Roman" w:eastAsia="Times New Roman" w:hAnsi="Times New Roman" w:cs="Times New Roman"/>
-          <w:kern w:val="0"/>
-          <w:lang w:eastAsia="en-IN"/>
-          <w14:ligatures w14:val="none"/>
-        </w:rPr>
-      </w:pPr>
-      <w:r>
-        <w:rPr>
-          <w:rFonts w:ascii="Times New Roman" w:eastAsia="Times New Roman" w:hAnsi="Times New Roman" w:cs="Times New Roman"/>
-          <w:kern w:val="0"/>
-          <w:lang w:eastAsia="en-IN"/>
-          <w14:ligatures w14:val="none"/>
-        </w:rPr>
-        <w:t>Used for creating the chatbot interface structure including:</w:t>
-      </w:r>
-    </w:p>
-    <w:p>
-      <w:pPr>
-        <w:numPr>
-          <w:ilvl w:val="0"/>
-          <w:numId w:val="2"/>
-        </w:numPr>
-        <w:spacing w:before="100" w:beforeAutospacing="1" w:after="100" w:afterAutospacing="1" w:line="240" w:lineRule="auto"/>
-        <w:rPr>
-          <w:rFonts w:ascii="Times New Roman" w:eastAsia="Times New Roman" w:hAnsi="Times New Roman" w:cs="Times New Roman"/>
-          <w:kern w:val="0"/>
-          <w:lang w:eastAsia="en-IN"/>
-          <w14:ligatures w14:val="none"/>
-        </w:rPr>
-      </w:pPr>
-      <w:r>
-        <w:rPr>
-          <w:rFonts w:ascii="Times New Roman" w:eastAsia="Times New Roman" w:hAnsi="Times New Roman" w:cs="Times New Roman"/>
-          <w:kern w:val="0"/>
-          <w:lang w:eastAsia="en-IN"/>
-          <w14:ligatures w14:val="none"/>
-        </w:rPr>
-        <w:t>Chat window</w:t>
-      </w:r>
-    </w:p>
-    <w:p>
-      <w:pPr>
-        <w:numPr>
-          <w:ilvl w:val="0"/>
-          <w:numId w:val="2"/>
-        </w:numPr>
-        <w:spacing w:before="100" w:beforeAutospacing="1" w:after="100" w:afterAutospacing="1" w:line="240" w:lineRule="auto"/>
-        <w:rPr>
-          <w:rFonts w:ascii="Times New Roman" w:eastAsia="Times New Roman" w:hAnsi="Times New Roman" w:cs="Times New Roman"/>
-          <w:kern w:val="0"/>
-          <w:lang w:eastAsia="en-IN"/>
-          <w14:ligatures w14:val="none"/>
-        </w:rPr>
-      </w:pPr>
-      <w:r>
-        <w:rPr>
-          <w:rFonts w:ascii="Times New Roman" w:eastAsia="Times New Roman" w:hAnsi="Times New Roman" w:cs="Times New Roman"/>
-          <w:kern w:val="0"/>
-          <w:lang w:eastAsia="en-IN"/>
-          <w14:ligatures w14:val="none"/>
-        </w:rPr>
-        <w:t>Input box</w:t>
-      </w:r>
-    </w:p>
-    <w:p>
-      <w:pPr>
-        <w:numPr>
-          <w:ilvl w:val="0"/>
-          <w:numId w:val="2"/>
-        </w:numPr>
-        <w:spacing w:before="100" w:beforeAutospacing="1" w:after="100" w:afterAutospacing="1" w:line="240" w:lineRule="auto"/>
-        <w:rPr>
-          <w:rFonts w:ascii="Times New Roman" w:eastAsia="Times New Roman" w:hAnsi="Times New Roman" w:cs="Times New Roman"/>
-          <w:kern w:val="0"/>
-          <w:lang w:eastAsia="en-IN"/>
-          <w14:ligatures w14:val="none"/>
-        </w:rPr>
-      </w:pPr>
-      <w:r>
-        <w:rPr>
-          <w:rFonts w:ascii="Times New Roman" w:eastAsia="Times New Roman" w:hAnsi="Times New Roman" w:cs="Times New Roman"/>
-          <w:kern w:val="0"/>
-          <w:lang w:eastAsia="en-IN"/>
-          <w14:ligatures w14:val="none"/>
-        </w:rPr>
-        <w:lastRenderedPageBreak/>
-        <w:t>Send button</w:t>
-      </w:r>
-    </w:p>
-    <w:p>
-      <w:pPr>
-        <w:numPr>
-          <w:ilvl w:val="0"/>
-          <w:numId w:val="2"/>
-        </w:numPr>
-        <w:spacing w:before="100" w:beforeAutospacing="1" w:after="100" w:afterAutospacing="1" w:line="240" w:lineRule="auto"/>
-        <w:rPr>
-          <w:rFonts w:ascii="Times New Roman" w:eastAsia="Times New Roman" w:hAnsi="Times New Roman" w:cs="Times New Roman"/>
-          <w:kern w:val="0"/>
-          <w:lang w:eastAsia="en-IN"/>
-          <w14:ligatures w14:val="none"/>
-        </w:rPr>
-      </w:pPr>
-      <w:r>
-        <w:rPr>
-          <w:rFonts w:ascii="Times New Roman" w:eastAsia="Times New Roman" w:hAnsi="Times New Roman" w:cs="Times New Roman"/>
-          <w:kern w:val="0"/>
-          <w:lang w:eastAsia="en-IN"/>
-          <w14:ligatures w14:val="none"/>
-        </w:rPr>
-        <w:t>Message layout</w:t>
-      </w:r>
-    </w:p>
-    <w:p>
-      <w:pPr>
-        <w:spacing w:before="100" w:beforeAutospacing="1" w:after="100" w:afterAutospacing="1" w:line="240" w:lineRule="auto"/>
-        <w:outlineLvl w:val="2"/>
-        <w:rPr>
-          <w:rFonts w:ascii="Times New Roman" w:eastAsia="Times New Roman" w:hAnsi="Times New Roman" w:cs="Times New Roman"/>
-          <w:b/>
-          <w:bCs/>
-          <w:kern w:val="0"/>
-          <w:sz w:val="27"/>
-          <w:szCs w:val="27"/>
-          <w:lang w:eastAsia="en-IN"/>
-          <w14:ligatures w14:val="none"/>
-        </w:rPr>
-      </w:pPr>
-      <w:r>
-        <w:rPr>
-          <w:rFonts w:ascii="Times New Roman" w:eastAsia="Times New Roman" w:hAnsi="Times New Roman" w:cs="Times New Roman"/>
-          <w:b/>
-          <w:bCs/>
-          <w:kern w:val="0"/>
-          <w:sz w:val="27"/>
-          <w:szCs w:val="27"/>
-          <w:lang w:eastAsia="en-IN"/>
-          <w14:ligatures w14:val="none"/>
-        </w:rPr>
-        <w:t>CSS</w:t>
-      </w:r>
-    </w:p>
-    <w:p>
-      <w:pPr>
-        <w:spacing w:before="100" w:beforeAutospacing="1" w:after="100" w:afterAutospacing="1" w:line="240" w:lineRule="auto"/>
-        <w:rPr>
-          <w:rFonts w:ascii="Times New Roman" w:eastAsia="Times New Roman" w:hAnsi="Times New Roman" w:cs="Times New Roman"/>
-          <w:kern w:val="0"/>
-          <w:lang w:eastAsia="en-IN"/>
-          <w14:ligatures w14:val="none"/>
-        </w:rPr>
-      </w:pPr>
-      <w:r>
-        <w:rPr>
-          <w:rFonts w:ascii="Times New Roman" w:eastAsia="Times New Roman" w:hAnsi="Times New Roman" w:cs="Times New Roman"/>
-          <w:kern w:val="0"/>
-          <w:lang w:eastAsia="en-IN"/>
-          <w14:ligatures w14:val="none"/>
-        </w:rPr>
-        <w:t>Used for designing the chatbot UI:</w:t>
-      </w:r>
-    </w:p>
-    <w:p>
-      <w:pPr>
-        <w:numPr>
-          <w:ilvl w:val="0"/>
-          <w:numId w:val="3"/>
-        </w:numPr>
-        <w:spacing w:before="100" w:beforeAutospacing="1" w:after="100" w:afterAutospacing="1" w:line="240" w:lineRule="auto"/>
-        <w:rPr>
-          <w:rFonts w:ascii="Times New Roman" w:eastAsia="Times New Roman" w:hAnsi="Times New Roman" w:cs="Times New Roman"/>
-          <w:kern w:val="0"/>
-          <w:lang w:eastAsia="en-IN"/>
-          <w14:ligatures w14:val="none"/>
-        </w:rPr>
-      </w:pPr>
-      <w:r>
-        <w:rPr>
-          <w:rFonts w:ascii="Times New Roman" w:eastAsia="Times New Roman" w:hAnsi="Times New Roman" w:cs="Times New Roman"/>
-          <w:kern w:val="0"/>
-          <w:lang w:eastAsia="en-IN"/>
-          <w14:ligatures w14:val="none"/>
-        </w:rPr>
-        <w:t>Chat bubbles</w:t>
-      </w:r>
-    </w:p>
-    <w:p>
-      <w:pPr>
-        <w:numPr>
-          <w:ilvl w:val="0"/>
-          <w:numId w:val="3"/>
-        </w:numPr>
-        <w:spacing w:before="100" w:beforeAutospacing="1" w:after="100" w:afterAutospacing="1" w:line="240" w:lineRule="auto"/>
-        <w:rPr>
-          <w:rFonts w:ascii="Times New Roman" w:eastAsia="Times New Roman" w:hAnsi="Times New Roman" w:cs="Times New Roman"/>
-          <w:kern w:val="0"/>
-          <w:lang w:eastAsia="en-IN"/>
-          <w14:ligatures w14:val="none"/>
-        </w:rPr>
-      </w:pPr>
-      <w:proofErr w:type="spellStart"/>
-      <w:r>
-        <w:rPr>
-          <w:rFonts w:ascii="Times New Roman" w:eastAsia="Times New Roman" w:hAnsi="Times New Roman" w:cs="Times New Roman"/>
-          <w:kern w:val="0"/>
-          <w:lang w:eastAsia="en-IN"/>
-          <w14:ligatures w14:val="none"/>
-        </w:rPr>
-        <w:t>Colors</w:t>
-      </w:r>
-      <w:proofErr w:type="spellEnd"/>
-      <w:r>
-        <w:rPr>
-          <w:rFonts w:ascii="Times New Roman" w:eastAsia="Times New Roman" w:hAnsi="Times New Roman" w:cs="Times New Roman"/>
-          <w:kern w:val="0"/>
-          <w:lang w:eastAsia="en-IN"/>
-          <w14:ligatures w14:val="none"/>
-        </w:rPr>
-        <w:t xml:space="preserve"> and theme</w:t>
-      </w:r>
-    </w:p>
-    <w:p>
-      <w:pPr>
-        <w:numPr>
-          <w:ilvl w:val="0"/>
-          <w:numId w:val="3"/>
-        </w:numPr>
-        <w:spacing w:before="100" w:beforeAutospacing="1" w:after="100" w:afterAutospacing="1" w:line="240" w:lineRule="auto"/>
-        <w:rPr>
-          <w:rFonts w:ascii="Times New Roman" w:eastAsia="Times New Roman" w:hAnsi="Times New Roman" w:cs="Times New Roman"/>
-          <w:kern w:val="0"/>
-          <w:lang w:eastAsia="en-IN"/>
-          <w14:ligatures w14:val="none"/>
-        </w:rPr>
-      </w:pPr>
-      <w:r>
-        <w:rPr>
-          <w:rFonts w:ascii="Times New Roman" w:eastAsia="Times New Roman" w:hAnsi="Times New Roman" w:cs="Times New Roman"/>
-          <w:kern w:val="0"/>
-          <w:lang w:eastAsia="en-IN"/>
-          <w14:ligatures w14:val="none"/>
-        </w:rPr>
-        <w:t>Responsive layout</w:t>
-      </w:r>
-    </w:p>
-    <w:p>
-      <w:pPr>
-        <w:numPr>
-          <w:ilvl w:val="0"/>
-          <w:numId w:val="3"/>
-        </w:numPr>
-        <w:spacing w:before="100" w:beforeAutospacing="1" w:after="100" w:afterAutospacing="1" w:line="240" w:lineRule="auto"/>
-        <w:rPr>
-          <w:rFonts w:ascii="Times New Roman" w:eastAsia="Times New Roman" w:hAnsi="Times New Roman" w:cs="Times New Roman"/>
-          <w:kern w:val="0"/>
-          <w:lang w:eastAsia="en-IN"/>
-          <w14:ligatures w14:val="none"/>
-        </w:rPr>
-      </w:pPr>
-      <w:r>
-        <w:rPr>
-          <w:rFonts w:ascii="Times New Roman" w:eastAsia="Times New Roman" w:hAnsi="Times New Roman" w:cs="Times New Roman"/>
-          <w:kern w:val="0"/>
-          <w:lang w:eastAsia="en-IN"/>
-          <w14:ligatures w14:val="none"/>
-        </w:rPr>
-        <w:t>Buttons and animations</w:t>
-      </w:r>
-    </w:p>
-    <w:p>
-      <w:pPr>
-        <w:spacing w:before="100" w:beforeAutospacing="1" w:after="100" w:afterAutospacing="1" w:line="240" w:lineRule="auto"/>
-        <w:outlineLvl w:val="2"/>
-        <w:rPr>
-          <w:rFonts w:ascii="Times New Roman" w:eastAsia="Times New Roman" w:hAnsi="Times New Roman" w:cs="Times New Roman"/>
-          <w:b/>
-          <w:bCs/>
-          <w:kern w:val="0"/>
-          <w:sz w:val="27"/>
-          <w:szCs w:val="27"/>
-          <w:lang w:eastAsia="en-IN"/>
-          <w14:ligatures w14:val="none"/>
-        </w:rPr>
-      </w:pPr>
-      <w:r>
-        <w:rPr>
-          <w:rFonts w:ascii="Times New Roman" w:eastAsia="Times New Roman" w:hAnsi="Times New Roman" w:cs="Times New Roman"/>
-          <w:b/>
-          <w:bCs/>
-          <w:kern w:val="0"/>
-          <w:sz w:val="27"/>
-          <w:szCs w:val="27"/>
-          <w:lang w:eastAsia="en-IN"/>
-          <w14:ligatures w14:val="none"/>
-        </w:rPr>
-        <w:t>JavaScript</w:t>
-      </w:r>
-    </w:p>
-    <w:p>
-      <w:pPr>
-        <w:spacing w:before="100" w:beforeAutospacing="1" w:after="100" w:afterAutospacing="1" w:line="240" w:lineRule="auto"/>
-        <w:rPr>
-          <w:rFonts w:ascii="Times New Roman" w:eastAsia="Times New Roman" w:hAnsi="Times New Roman" w:cs="Times New Roman"/>
-          <w:kern w:val="0"/>
-          <w:lang w:eastAsia="en-IN"/>
-          <w14:ligatures w14:val="none"/>
-        </w:rPr>
-      </w:pPr>
-      <w:r>
-        <w:rPr>
-          <w:rFonts w:ascii="Times New Roman" w:eastAsia="Times New Roman" w:hAnsi="Times New Roman" w:cs="Times New Roman"/>
-          <w:kern w:val="0"/>
-          <w:lang w:eastAsia="en-IN"/>
-          <w14:ligatures w14:val="none"/>
-        </w:rPr>
-        <w:t>Used for chatbot logic:</w:t>
-      </w:r>
-    </w:p>
-    <w:p>
-      <w:pPr>
-        <w:numPr>
-          <w:ilvl w:val="0"/>
-          <w:numId w:val="4"/>
-        </w:numPr>
-        <w:spacing w:before="100" w:beforeAutospacing="1" w:after="100" w:afterAutospacing="1" w:line="240" w:lineRule="auto"/>
-        <w:rPr>
-          <w:rFonts w:ascii="Times New Roman" w:eastAsia="Times New Roman" w:hAnsi="Times New Roman" w:cs="Times New Roman"/>
-          <w:kern w:val="0"/>
-          <w:lang w:eastAsia="en-IN"/>
-          <w14:ligatures w14:val="none"/>
-        </w:rPr>
-      </w:pPr>
-      <w:r>
-        <w:rPr>
-          <w:rFonts w:ascii="Times New Roman" w:eastAsia="Times New Roman" w:hAnsi="Times New Roman" w:cs="Times New Roman"/>
-          <w:kern w:val="0"/>
-          <w:lang w:eastAsia="en-IN"/>
-          <w14:ligatures w14:val="none"/>
-        </w:rPr>
-        <w:t>Processing user input</w:t>
-      </w:r>
-    </w:p>
-    <w:p>
-      <w:pPr>
-        <w:numPr>
-          <w:ilvl w:val="0"/>
-          <w:numId w:val="4"/>
-        </w:numPr>
-        <w:spacing w:before="100" w:beforeAutospacing="1" w:after="100" w:afterAutospacing="1" w:line="240" w:lineRule="auto"/>
-        <w:rPr>
-          <w:rFonts w:ascii="Times New Roman" w:eastAsia="Times New Roman" w:hAnsi="Times New Roman" w:cs="Times New Roman"/>
-          <w:kern w:val="0"/>
-          <w:lang w:eastAsia="en-IN"/>
-          <w14:ligatures w14:val="none"/>
-        </w:rPr>
-      </w:pPr>
-      <w:r>
-        <w:rPr>
-          <w:rFonts w:ascii="Times New Roman" w:eastAsia="Times New Roman" w:hAnsi="Times New Roman" w:cs="Times New Roman"/>
-          <w:kern w:val="0"/>
-          <w:lang w:eastAsia="en-IN"/>
-          <w14:ligatures w14:val="none"/>
-        </w:rPr>
-        <w:t>Keyword matching</w:t>
-      </w:r>
-    </w:p>
-    <w:p>
-      <w:pPr>
-        <w:numPr>
-          <w:ilvl w:val="0"/>
-          <w:numId w:val="4"/>
-        </w:numPr>
-        <w:spacing w:before="100" w:beforeAutospacing="1" w:after="100" w:afterAutospacing="1" w:line="240" w:lineRule="auto"/>
-        <w:rPr>
-          <w:rFonts w:ascii="Times New Roman" w:eastAsia="Times New Roman" w:hAnsi="Times New Roman" w:cs="Times New Roman"/>
-          <w:kern w:val="0"/>
-          <w:lang w:eastAsia="en-IN"/>
-          <w14:ligatures w14:val="none"/>
-        </w:rPr>
-      </w:pPr>
-      <w:r>
-        <w:rPr>
-          <w:rFonts w:ascii="Times New Roman" w:eastAsia="Times New Roman" w:hAnsi="Times New Roman" w:cs="Times New Roman"/>
-          <w:kern w:val="0"/>
-          <w:lang w:eastAsia="en-IN"/>
-          <w14:ligatures w14:val="none"/>
-        </w:rPr>
-        <w:t>Generating responses</w:t>
-      </w:r>
-    </w:p>
-    <w:p>
-      <w:pPr>
-        <w:numPr>
-          <w:ilvl w:val="0"/>
-          <w:numId w:val="4"/>
-        </w:numPr>
-        <w:spacing w:before="100" w:beforeAutospacing="1" w:after="100" w:afterAutospacing="1" w:line="240" w:lineRule="auto"/>
-        <w:rPr>
-          <w:rFonts w:ascii="Times New Roman" w:eastAsia="Times New Roman" w:hAnsi="Times New Roman" w:cs="Times New Roman"/>
-          <w:kern w:val="0"/>
-          <w:lang w:eastAsia="en-IN"/>
-          <w14:ligatures w14:val="none"/>
-        </w:rPr>
-      </w:pPr>
-      <w:r>
-        <w:rPr>
-          <w:rFonts w:ascii="Times New Roman" w:eastAsia="Times New Roman" w:hAnsi="Times New Roman" w:cs="Times New Roman"/>
-          <w:kern w:val="0"/>
-          <w:lang w:eastAsia="en-IN"/>
-          <w14:ligatures w14:val="none"/>
-        </w:rPr>
-        <w:t>Quick option buttons</w:t>
-      </w:r>
-    </w:p>
-    <w:p>
-      <w:pPr>
-        <w:numPr>
-          <w:ilvl w:val="0"/>
-          <w:numId w:val="4"/>
-        </w:numPr>
-        <w:spacing w:before="100" w:beforeAutospacing="1" w:after="100" w:afterAutospacing="1" w:line="240" w:lineRule="auto"/>
-        <w:rPr>
-          <w:rFonts w:ascii="Times New Roman" w:eastAsia="Times New Roman" w:hAnsi="Times New Roman" w:cs="Times New Roman"/>
-          <w:kern w:val="0"/>
-          <w:lang w:eastAsia="en-IN"/>
-          <w14:ligatures w14:val="none"/>
-        </w:rPr>
-      </w:pPr>
-      <w:r>
-        <w:rPr>
-          <w:rFonts w:ascii="Times New Roman" w:eastAsia="Times New Roman" w:hAnsi="Times New Roman" w:cs="Times New Roman"/>
-          <w:kern w:val="0"/>
-          <w:lang w:eastAsia="en-IN"/>
-          <w14:ligatures w14:val="none"/>
-        </w:rPr>
-        <w:t>Fallback handling</w:t>
-      </w:r>
-    </w:p>
-    <w:p>
-      <w:pPr>
-        <w:spacing w:before="100" w:beforeAutospacing="1" w:after="100" w:afterAutospacing="1" w:line="240" w:lineRule="auto"/>
-        <w:outlineLvl w:val="2"/>
-        <w:rPr>
-          <w:rFonts w:ascii="Times New Roman" w:eastAsia="Times New Roman" w:hAnsi="Times New Roman" w:cs="Times New Roman"/>
-          <w:b/>
-          <w:bCs/>
-          <w:kern w:val="0"/>
-          <w:sz w:val="27"/>
-          <w:szCs w:val="27"/>
-          <w:lang w:eastAsia="en-IN"/>
-          <w14:ligatures w14:val="none"/>
-        </w:rPr>
-      </w:pPr>
-      <w:r>
-        <w:rPr>
-          <w:rFonts w:ascii="Times New Roman" w:eastAsia="Times New Roman" w:hAnsi="Times New Roman" w:cs="Times New Roman"/>
-          <w:b/>
-          <w:bCs/>
-          <w:kern w:val="0"/>
-          <w:sz w:val="27"/>
-          <w:szCs w:val="27"/>
-          <w:lang w:eastAsia="en-IN"/>
-          <w14:ligatures w14:val="none"/>
-        </w:rPr>
-        <w:t>Knowledge Base Logic</w:t>
-      </w:r>
-    </w:p>
-    <w:p>
-      <w:pPr>
-        <w:spacing w:before="100" w:beforeAutospacing="1" w:after="100" w:afterAutospacing="1" w:line="240" w:lineRule="auto"/>
-        <w:rPr>
-          <w:rFonts w:ascii="Times New Roman" w:eastAsia="Times New Roman" w:hAnsi="Times New Roman" w:cs="Times New Roman"/>
-          <w:kern w:val="0"/>
-          <w:lang w:eastAsia="en-IN"/>
-          <w14:ligatures w14:val="none"/>
-        </w:rPr>
-      </w:pPr>
-      <w:r>
-        <w:rPr>
-          <w:rFonts w:ascii="Times New Roman" w:eastAsia="Times New Roman" w:hAnsi="Times New Roman" w:cs="Times New Roman"/>
-          <w:kern w:val="0"/>
-          <w:lang w:eastAsia="en-IN"/>
-          <w14:ligatures w14:val="none"/>
-        </w:rPr>
-        <w:t>A rule-based chatbot approach was implemented where keywords are mapped with predefined responses.</w:t>
-      </w:r>
-    </w:p>
-    <w:p>
-      <w:pPr>
-        <w:spacing w:after="0" w:line="240" w:lineRule="auto"/>
-        <w:rPr>
-          <w:rFonts w:ascii="Times New Roman" w:eastAsia="Times New Roman" w:hAnsi="Times New Roman" w:cs="Times New Roman"/>
-          <w:kern w:val="0"/>
-          <w:lang w:eastAsia="en-IN"/>
-          <w14:ligatures w14:val="none"/>
-        </w:rPr>
-      </w:pPr>
-      <w:r>
-        <w:rPr>
-          <w:rFonts w:ascii="Times New Roman" w:eastAsia="Times New Roman" w:hAnsi="Times New Roman" w:cs="Times New Roman"/>
-          <w:kern w:val="0"/>
-          <w:lang w:eastAsia="en-IN"/>
-          <w14:ligatures w14:val="none"/>
-        </w:rPr>
-        <w:pict w14:anchorId="0704CF62">
-          <v:rect id="_x0000_i1027" style="width:0;height:1.5pt" o:hralign="center" o:hrstd="t" o:hr="t" fillcolor="#a0a0a0" stroked="f"/>
-        </w:pict>
-      </w:r>
-    </w:p>
-    <w:p>
-      <w:pPr>
-        <w:spacing w:before="100" w:beforeAutospacing="1" w:after="100" w:afterAutospacing="1" w:line="240" w:lineRule="auto"/>
-        <w:outlineLvl w:val="0"/>
+      </w:pPr>
+      <w:r>
         <w:rPr>
           <w:rFonts w:ascii="Times New Roman" w:eastAsia="Times New Roman" w:hAnsi="Times New Roman" w:cs="Times New Roman"/>
           <w:b/>
@@ -1129,25 +1071,25 @@
           <w:lang w:eastAsia="en-IN"/>
           <w14:ligatures w14:val="none"/>
         </w:rPr>
-      </w:pPr>
-      <w:r>
+        <w:t>4. Screenshots With Explanation</w:t>
+      </w:r>
+    </w:p>
+    <w:p>
+      <w:pPr>
+        <w:spacing w:before="100" w:beforeAutospacing="1" w:after="100" w:afterAutospacing="1" w:line="240" w:lineRule="auto"/>
+        <w:outlineLvl w:val="1"/>
         <w:rPr>
           <w:rFonts w:ascii="Times New Roman" w:eastAsia="Times New Roman" w:hAnsi="Times New Roman" w:cs="Times New Roman"/>
           <w:b/>
           <w:bCs/>
-          <w:kern w:val="36"/>
-          <w:sz w:val="48"/>
-          <w:szCs w:val="48"/>
-          <w:lang w:eastAsia="en-IN"/>
-          <w14:ligatures w14:val="none"/>
-        </w:rPr>
-        <w:t>4. Screenshots With Explanation</w:t>
-      </w:r>
-    </w:p>
-    <w:p>
-      <w:pPr>
-        <w:spacing w:before="100" w:beforeAutospacing="1" w:after="100" w:afterAutospacing="1" w:line="240" w:lineRule="auto"/>
-        <w:outlineLvl w:val="1"/>
+          <w:kern w:val="0"/>
+          <w:sz w:val="36"/>
+          <w:szCs w:val="36"/>
+          <w:lang w:eastAsia="en-IN"/>
+          <w14:ligatures w14:val="none"/>
+        </w:rPr>
+      </w:pPr>
+      <w:r>
         <w:rPr>
           <w:rFonts w:ascii="Times New Roman" w:eastAsia="Times New Roman" w:hAnsi="Times New Roman" w:cs="Times New Roman"/>
           <w:b/>
@@ -1158,18 +1100,6 @@
           <w:lang w:eastAsia="en-IN"/>
           <w14:ligatures w14:val="none"/>
         </w:rPr>
-      </w:pPr>
-      <w:r>
-        <w:rPr>
-          <w:rFonts w:ascii="Times New Roman" w:eastAsia="Times New Roman" w:hAnsi="Times New Roman" w:cs="Times New Roman"/>
-          <w:b/>
-          <w:bCs/>
-          <w:kern w:val="0"/>
-          <w:sz w:val="36"/>
-          <w:szCs w:val="36"/>
-          <w:lang w:eastAsia="en-IN"/>
-          <w14:ligatures w14:val="none"/>
-        </w:rPr>
         <w:t>Screenshot 1: Chatbot Home Interface</w:t>
       </w:r>
     </w:p>
@@ -1186,6 +1116,7 @@
       <w:r>
         <w:rPr>
           <w:rFonts w:ascii="Times New Roman" w:eastAsia="Times New Roman" w:hAnsi="Times New Roman" w:cs="Times New Roman"/>
+          <w:noProof/>
           <w:kern w:val="0"/>
           <w:lang w:eastAsia="en-IN"/>
           <w14:ligatures w14:val="none"/>
@@ -1265,27 +1196,7 @@
           <w:lang w:eastAsia="en-IN"/>
           <w14:ligatures w14:val="none"/>
         </w:rPr>
-        <w:t xml:space="preserve">This screenshot shows the </w:t>
-      </w:r>
-      <w:proofErr w:type="spellStart"/>
-      <w:r>
-        <w:rPr>
-          <w:rFonts w:ascii="Times New Roman" w:eastAsia="Times New Roman" w:hAnsi="Times New Roman" w:cs="Times New Roman"/>
-          <w:kern w:val="0"/>
-          <w:lang w:eastAsia="en-IN"/>
-          <w14:ligatures w14:val="none"/>
-        </w:rPr>
-        <w:t>CampusBot</w:t>
-      </w:r>
-      <w:proofErr w:type="spellEnd"/>
-      <w:r>
-        <w:rPr>
-          <w:rFonts w:ascii="Times New Roman" w:eastAsia="Times New Roman" w:hAnsi="Times New Roman" w:cs="Times New Roman"/>
-          <w:kern w:val="0"/>
-          <w:lang w:eastAsia="en-IN"/>
-          <w14:ligatures w14:val="none"/>
-        </w:rPr>
-        <w:t xml:space="preserve"> user interface. The chatbot starts with a welcome message and introduces itself as a university assistant. Users can type questions or select quick options.</w:t>
+        <w:t>This screenshot shows the CampusBot user interface. The chatbot starts with a welcome message and introduces itself as a university assistant. Users can type questions or select quick options.</w:t>
       </w:r>
     </w:p>
     <w:p>
@@ -1352,6 +1263,7 @@
       <w:r>
         <w:rPr>
           <w:rFonts w:ascii="Times New Roman" w:eastAsia="Times New Roman" w:hAnsi="Times New Roman" w:cs="Times New Roman"/>
+          <w:noProof/>
           <w:kern w:val="0"/>
           <w:lang w:eastAsia="en-IN"/>
           <w14:ligatures w14:val="none"/>
@@ -1566,6 +1478,7 @@
       <w:r>
         <w:rPr>
           <w:rFonts w:ascii="Times New Roman" w:eastAsia="Times New Roman" w:hAnsi="Times New Roman" w:cs="Times New Roman"/>
+          <w:noProof/>
           <w:kern w:val="0"/>
           <w:lang w:eastAsia="en-IN"/>
           <w14:ligatures w14:val="none"/>
@@ -1781,6 +1694,7 @@
       <w:r>
         <w:rPr>
           <w:rFonts w:ascii="Times New Roman" w:eastAsia="Times New Roman" w:hAnsi="Times New Roman" w:cs="Times New Roman"/>
+          <w:noProof/>
           <w:kern w:val="0"/>
           <w:lang w:eastAsia="en-IN"/>
           <w14:ligatures w14:val="none"/>
@@ -1921,25 +1835,14 @@
           <w14:ligatures w14:val="none"/>
         </w:rPr>
       </w:pPr>
-      <w:proofErr w:type="spellStart"/>
-      <w:r>
-        <w:rPr>
-          <w:rFonts w:ascii="Times New Roman" w:eastAsia="Times New Roman" w:hAnsi="Times New Roman" w:cs="Times New Roman"/>
-          <w:kern w:val="0"/>
-          <w:lang w:eastAsia="en-IN"/>
-          <w14:ligatures w14:val="none"/>
-        </w:rPr>
-        <w:t>CampusBot</w:t>
-      </w:r>
-      <w:proofErr w:type="spellEnd"/>
-      <w:r>
-        <w:rPr>
-          <w:rFonts w:ascii="Times New Roman" w:eastAsia="Times New Roman" w:hAnsi="Times New Roman" w:cs="Times New Roman"/>
-          <w:kern w:val="0"/>
-          <w:lang w:eastAsia="en-IN"/>
-          <w14:ligatures w14:val="none"/>
-        </w:rPr>
-        <w:t xml:space="preserve"> helps students access placement-related information instantly.</w:t>
+      <w:r>
+        <w:rPr>
+          <w:rFonts w:ascii="Times New Roman" w:eastAsia="Times New Roman" w:hAnsi="Times New Roman" w:cs="Times New Roman"/>
+          <w:kern w:val="0"/>
+          <w:lang w:eastAsia="en-IN"/>
+          <w14:ligatures w14:val="none"/>
+        </w:rPr>
+        <w:t>CampusBot helps students access placement-related information instantly.</w:t>
       </w:r>
     </w:p>
     <w:p>
@@ -2006,6 +1909,7 @@
       <w:r>
         <w:rPr>
           <w:rFonts w:ascii="Times New Roman" w:eastAsia="Times New Roman" w:hAnsi="Times New Roman" w:cs="Times New Roman"/>
+          <w:noProof/>
           <w:kern w:val="0"/>
           <w:lang w:eastAsia="en-IN"/>
           <w14:ligatures w14:val="none"/>
@@ -2054,16 +1958,7 @@
           <w:lang w:eastAsia="en-IN"/>
           <w14:ligatures w14:val="none"/>
         </w:rPr>
-        <w:t xml:space="preserve"> </w:t>
-      </w:r>
-      <w:r>
-        <w:rPr>
-          <w:rFonts w:ascii="Times New Roman" w:eastAsia="Times New Roman" w:hAnsi="Times New Roman" w:cs="Times New Roman"/>
-          <w:kern w:val="0"/>
-          <w:lang w:eastAsia="en-IN"/>
-          <w14:ligatures w14:val="none"/>
-        </w:rPr>
-        <w:t>Example:</w:t>
+        <w:t xml:space="preserve"> Example:</w:t>
       </w:r>
     </w:p>
     <w:p>
@@ -2244,8 +2139,19 @@
           <w14:ligatures w14:val="none"/>
         </w:rPr>
         <w:br/>
-        <w:t>(Add your GitHub link)</w:t>
-      </w:r>
+      </w:r>
+      <w:hyperlink r:id="rId10" w:history="1">
+        <w:r>
+          <w:rPr>
+            <w:rStyle w:val="Hyperlink"/>
+            <w:rFonts w:ascii="Times New Roman" w:eastAsia="Times New Roman" w:hAnsi="Times New Roman" w:cs="Times New Roman"/>
+            <w:kern w:val="0"/>
+            <w:lang w:eastAsia="en-IN"/>
+            <w14:ligatures w14:val="none"/>
+          </w:rPr>
+          <w:t>https://github.com/RayonBiswas/Lenovo-NextGen-AI-Projects</w:t>
+        </w:r>
+      </w:hyperlink>
     </w:p>
     <w:p>
       <w:pPr>
@@ -2274,8 +2180,59 @@
           <w14:ligatures w14:val="none"/>
         </w:rPr>
         <w:br/>
-        <w:t>(Add hosted project link)</w:t>
-      </w:r>
+      </w:r>
+      <w:hyperlink r:id="rId11" w:history="1">
+        <w:r>
+          <w:rPr>
+            <w:rStyle w:val="Hyperlink"/>
+            <w:rFonts w:ascii="Times New Roman" w:eastAsia="Times New Roman" w:hAnsi="Times New Roman" w:cs="Times New Roman"/>
+            <w:kern w:val="0"/>
+            <w:lang w:eastAsia="en-IN"/>
+            <w14:ligatures w14:val="none"/>
+          </w:rPr>
+          <w:t>(</w:t>
+        </w:r>
+        <w:r>
+          <w:rPr>
+            <w:rStyle w:val="Hyperlink"/>
+            <w:rFonts w:ascii="Times New Roman" w:eastAsia="Times New Roman" w:hAnsi="Times New Roman" w:cs="Times New Roman"/>
+            <w:kern w:val="0"/>
+            <w:lang w:eastAsia="en-IN"/>
+            <w14:ligatures w14:val="none"/>
+          </w:rPr>
+          <w:t>P</w:t>
+        </w:r>
+        <w:r>
+          <w:rPr>
+            <w:rStyle w:val="Hyperlink"/>
+            <w:rFonts w:ascii="Times New Roman" w:eastAsia="Times New Roman" w:hAnsi="Times New Roman" w:cs="Times New Roman"/>
+            <w:kern w:val="0"/>
+            <w:lang w:eastAsia="en-IN"/>
+            <w14:ligatures w14:val="none"/>
+          </w:rPr>
+          <w:t xml:space="preserve">roject </w:t>
+        </w:r>
+        <w:r>
+          <w:rPr>
+            <w:rStyle w:val="Hyperlink"/>
+            <w:rFonts w:ascii="Times New Roman" w:eastAsia="Times New Roman" w:hAnsi="Times New Roman" w:cs="Times New Roman"/>
+            <w:kern w:val="0"/>
+            <w:lang w:eastAsia="en-IN"/>
+            <w14:ligatures w14:val="none"/>
+          </w:rPr>
+          <w:t>l</w:t>
+        </w:r>
+        <w:r>
+          <w:rPr>
+            <w:rStyle w:val="Hyperlink"/>
+            <w:rFonts w:ascii="Times New Roman" w:eastAsia="Times New Roman" w:hAnsi="Times New Roman" w:cs="Times New Roman"/>
+            <w:kern w:val="0"/>
+            <w:lang w:eastAsia="en-IN"/>
+            <w14:ligatures w14:val="none"/>
+          </w:rPr>
+          <w:t>ink)</w:t>
+        </w:r>
+      </w:hyperlink>
     </w:p>
     <w:p>
       <w:pPr>
@@ -2305,36 +2262,6 @@
         </w:rPr>
         <w:br/>
         <w:t>Campus Assistant Chatbot HTML file</w:t>
-      </w:r>
-    </w:p>
-    <w:p>
-      <w:pPr>
-        <w:spacing w:before="100" w:beforeAutospacing="1" w:after="100" w:afterAutospacing="1" w:line="240" w:lineRule="auto"/>
-        <w:rPr>
-          <w:rFonts w:ascii="Times New Roman" w:eastAsia="Times New Roman" w:hAnsi="Times New Roman" w:cs="Times New Roman"/>
-          <w:kern w:val="0"/>
-          <w:lang w:eastAsia="en-IN"/>
-          <w14:ligatures w14:val="none"/>
-        </w:rPr>
-      </w:pPr>
-      <w:r>
-        <w:rPr>
-          <w:rFonts w:ascii="Times New Roman" w:eastAsia="Times New Roman" w:hAnsi="Times New Roman" w:cs="Times New Roman"/>
-          <w:kern w:val="0"/>
-          <w:lang w:eastAsia="en-IN"/>
-          <w14:ligatures w14:val="none"/>
-        </w:rPr>
-        <w:t>Video Demonstration:</w:t>
-      </w:r>
-      <w:r>
-        <w:rPr>
-          <w:rFonts w:ascii="Times New Roman" w:eastAsia="Times New Roman" w:hAnsi="Times New Roman" w:cs="Times New Roman"/>
-          <w:kern w:val="0"/>
-          <w:lang w:eastAsia="en-IN"/>
-          <w14:ligatures w14:val="none"/>
-        </w:rPr>
-        <w:br/>
-        <w:t>(Add video link if available)</w:t>
       </w:r>
     </w:p>
     <w:p>
@@ -2398,25 +2325,14 @@
           <w14:ligatures w14:val="none"/>
         </w:rPr>
       </w:pPr>
-      <w:proofErr w:type="spellStart"/>
-      <w:r>
-        <w:rPr>
-          <w:rFonts w:ascii="Times New Roman" w:eastAsia="Times New Roman" w:hAnsi="Times New Roman" w:cs="Times New Roman"/>
-          <w:kern w:val="0"/>
-          <w:lang w:eastAsia="en-IN"/>
-          <w14:ligatures w14:val="none"/>
-        </w:rPr>
-        <w:t>CampusBot</w:t>
-      </w:r>
-      <w:proofErr w:type="spellEnd"/>
-      <w:r>
-        <w:rPr>
-          <w:rFonts w:ascii="Times New Roman" w:eastAsia="Times New Roman" w:hAnsi="Times New Roman" w:cs="Times New Roman"/>
-          <w:kern w:val="0"/>
-          <w:lang w:eastAsia="en-IN"/>
-          <w14:ligatures w14:val="none"/>
-        </w:rPr>
-        <w:t xml:space="preserve"> successfully demonstrates how a chatbot can automate communication between students and campus services.</w:t>
+      <w:r>
+        <w:rPr>
+          <w:rFonts w:ascii="Times New Roman" w:eastAsia="Times New Roman" w:hAnsi="Times New Roman" w:cs="Times New Roman"/>
+          <w:kern w:val="0"/>
+          <w:lang w:eastAsia="en-IN"/>
+          <w14:ligatures w14:val="none"/>
+        </w:rPr>
+        <w:t>CampusBot successfully demonstrates how a chatbot can automate communication between students and campus services.</w:t>
       </w:r>
     </w:p>
     <w:p>
@@ -2532,7 +2448,6 @@
           <w:lang w:eastAsia="en-IN"/>
           <w14:ligatures w14:val="none"/>
         </w:rPr>
-        <w:lastRenderedPageBreak/>
         <w:t>Implementing rule-based response systems</w:t>
       </w:r>
     </w:p>
@@ -2577,6 +2492,7 @@
           <w:lang w:eastAsia="en-IN"/>
           <w14:ligatures w14:val="none"/>
         </w:rPr>
+        <w:lastRenderedPageBreak/>
         <w:t>The project can be further improved by integrating AI models, natural language processing, voice assistance, and database connectivity.</w:t>
       </w:r>
     </w:p>
@@ -4297,6 +4213,41 @@
       <w:bCs/>
     </w:rPr>
   </w:style>
+  <w:style w:type="character" w:styleId="Hyperlink">
+    <w:name w:val="Hyperlink"/>
+    <w:basedOn w:val="DefaultParagraphFont"/>
+    <w:uiPriority w:val="99"/>
+    <w:unhideWhenUsed/>
+    <w:rsid w:val="00FB31F2"/>
+    <w:rPr>
+      <w:color w:val="467886" w:themeColor="hyperlink"/>
+      <w:u w:val="single"/>
+    </w:rPr>
+  </w:style>
+  <w:style w:type="character" w:styleId="UnresolvedMention">
+    <w:name w:val="Unresolved Mention"/>
+    <w:basedOn w:val="DefaultParagraphFont"/>
+    <w:uiPriority w:val="99"/>
+    <w:semiHidden/>
+    <w:unhideWhenUsed/>
+    <w:rsid w:val="00FB31F2"/>
+    <w:rPr>
+      <w:color w:val="605E5C"/>
+      <w:shd w:val="clear" w:color="auto" w:fill="E1DFDD"/>
+    </w:rPr>
+  </w:style>
+  <w:style w:type="character" w:styleId="FollowedHyperlink">
+    <w:name w:val="FollowedHyperlink"/>
+    <w:basedOn w:val="DefaultParagraphFont"/>
+    <w:uiPriority w:val="99"/>
+    <w:semiHidden/>
+    <w:unhideWhenUsed/>
+    <w:rsid w:val="00FB31F2"/>
+    <w:rPr>
+      <w:color w:val="96607D" w:themeColor="followedHyperlink"/>
+      <w:u w:val="single"/>
+    </w:rPr>
+  </w:style>
 </w:styles>
 </file>
 

</xml_diff>